<commit_message>
update: refresh storage research data, add utility scripts, and reorganize documentation assets
</commit_message>
<xml_diff>
--- a/Cloud Computing & Cloud Storages/Cloud_Computing_AWS_Trabalho.docx
+++ b/Cloud Computing & Cloud Storages/Cloud_Computing_AWS_Trabalho.docx
@@ -798,6 +798,201 @@
       </w:r>
     </w:p>
     <w:p>
+      <w:r>
+        <w:t>8.5 Arquitetura, limites e cenários</w:t>
+      </w:r>
+    </w:p>
+    <w:p>
+      <w:r>
+        <w:t>Arquitetura-base: S3 como data lake em formato colunar/particionado; Glue Catalog; Athena para ad hoc, EMR para lote e Redshift/Spectrum para analytics recorrente; lifecycle por temperatura; camada separada de banco operacional. S3 não limita o total agregado do bucket, mas cada serviço consumidor tem quotas. Aurora e EBS possuem limites por cluster/volume e não acomodam 3,5 PB em uma única unidade. Confirmar limites atuais por versão e região.</w:t>
+      </w:r>
+    </w:p>
+    <w:tbl>
+      <w:tblPr>
+        <w:tblW w:type="auto" w:w="0"/>
+        <w:tblLook w:firstColumn="1" w:firstRow="1" w:lastColumn="0" w:lastRow="0" w:noHBand="0" w:noVBand="1" w:val="04A0"/>
+      </w:tblPr>
+      <w:tblGrid>
+        <w:gridCol w:w="2409"/>
+        <w:gridCol w:w="2409"/>
+        <w:gridCol w:w="2409"/>
+        <w:gridCol w:w="2409"/>
+      </w:tblGrid>
+      <w:tr>
+        <w:tc>
+          <w:tcPr>
+            <w:tcW w:type="dxa" w:w="2409"/>
+          </w:tcPr>
+          <w:p>
+            <w:r>
+              <w:t>Cenário</w:t>
+            </w:r>
+          </w:p>
+        </w:tc>
+        <w:tc>
+          <w:tcPr>
+            <w:tcW w:type="dxa" w:w="2409"/>
+          </w:tcPr>
+          <w:p>
+            <w:r>
+              <w:t>Acesso</w:t>
+            </w:r>
+          </w:p>
+        </w:tc>
+        <w:tc>
+          <w:tcPr>
+            <w:tcW w:type="dxa" w:w="2409"/>
+          </w:tcPr>
+          <w:p>
+            <w:r>
+              <w:t>Arquitetura</w:t>
+            </w:r>
+          </w:p>
+        </w:tc>
+        <w:tc>
+          <w:tcPr>
+            <w:tcW w:type="dxa" w:w="2409"/>
+          </w:tcPr>
+          <w:p>
+            <w:r>
+              <w:t>Custos a modelar</w:t>
+            </w:r>
+          </w:p>
+        </w:tc>
+      </w:tr>
+      <w:tr>
+        <w:tc>
+          <w:tcPr>
+            <w:tcW w:type="dxa" w:w="2409"/>
+          </w:tcPr>
+          <w:p>
+            <w:r>
+              <w:t>Econômico/arquivo</w:t>
+            </w:r>
+          </w:p>
+        </w:tc>
+        <w:tc>
+          <w:tcPr>
+            <w:tcW w:type="dxa" w:w="2409"/>
+          </w:tcPr>
+          <w:p>
+            <w:r>
+              <w:t>Raro; RTO 12–48 h</w:t>
+            </w:r>
+          </w:p>
+        </w:tc>
+        <w:tc>
+          <w:tcPr>
+            <w:tcW w:type="dxa" w:w="2409"/>
+          </w:tcPr>
+          <w:p>
+            <w:r>
+              <w:t>S3 Glacier + catálogo/imutabilidade</w:t>
+            </w:r>
+          </w:p>
+        </w:tc>
+        <w:tc>
+          <w:tcPr>
+            <w:tcW w:type="dxa" w:w="2409"/>
+          </w:tcPr>
+          <w:p>
+            <w:r>
+              <w:t>Storage, metadata, retrieval, permanência</w:t>
+            </w:r>
+          </w:p>
+        </w:tc>
+      </w:tr>
+      <w:tr>
+        <w:tc>
+          <w:tcPr>
+            <w:tcW w:type="dxa" w:w="2409"/>
+          </w:tcPr>
+          <w:p>
+            <w:r>
+              <w:t>Analytics típico</w:t>
+            </w:r>
+          </w:p>
+        </w:tc>
+        <w:tc>
+          <w:tcPr>
+            <w:tcW w:type="dxa" w:w="2409"/>
+          </w:tcPr>
+          <w:p>
+            <w:r>
+              <w:t>Consultas particionadas</w:t>
+            </w:r>
+          </w:p>
+        </w:tc>
+        <w:tc>
+          <w:tcPr>
+            <w:tcW w:type="dxa" w:w="2409"/>
+          </w:tcPr>
+          <w:p>
+            <w:r>
+              <w:t>S3 Parquet + Glue + Athena/EMR</w:t>
+            </w:r>
+          </w:p>
+        </w:tc>
+        <w:tc>
+          <w:tcPr>
+            <w:tcW w:type="dxa" w:w="2409"/>
+          </w:tcPr>
+          <w:p>
+            <w:r>
+              <w:t>Storage, TB lido, requests, suporte</w:t>
+            </w:r>
+          </w:p>
+        </w:tc>
+      </w:tr>
+      <w:tr>
+        <w:tc>
+          <w:tcPr>
+            <w:tcW w:type="dxa" w:w="2409"/>
+          </w:tcPr>
+          <w:p>
+            <w:r>
+              <w:t>Alto desempenho</w:t>
+            </w:r>
+          </w:p>
+        </w:tc>
+        <w:tc>
+          <w:tcPr>
+            <w:tcW w:type="dxa" w:w="2409"/>
+          </w:tcPr>
+          <w:p>
+            <w:r>
+              <w:t>Recorrente/baixa latência</w:t>
+            </w:r>
+          </w:p>
+        </w:tc>
+        <w:tc>
+          <w:tcPr>
+            <w:tcW w:type="dxa" w:w="2409"/>
+          </w:tcPr>
+          <w:p>
+            <w:r>
+              <w:t>S3 + Redshift/compute dimensionado</w:t>
+            </w:r>
+          </w:p>
+        </w:tc>
+        <w:tc>
+          <w:tcPr>
+            <w:tcW w:type="dxa" w:w="2409"/>
+          </w:tcPr>
+          <w:p>
+            <w:r>
+              <w:t>Compute, réplicas, cache, AZ/egress</w:t>
+            </w:r>
+          </w:p>
+        </w:tc>
+      </w:tr>
+    </w:tbl>
+    <w:p>
+      <w:r>
+        <w:t>Transferência inicial ideal: 3,5 PB a 10 Gb/s ≈ 32,4 dias; a 100 Gb/s ≈ 3,24 dias, antes de protocolo, criptografia e contenção. Avaliar Direct Connect, DataSync e dispositivos de transferência com quotas/cotações atuais. Para cada cenário, definir crescimento, compressão, tamanho/número de objetos, RPO, RTO e teste de recuperação.</w:t>
+      </w:r>
+    </w:p>
+    <w:p>
       <w:pPr>
         <w:spacing w:after="120"/>
       </w:pPr>
@@ -824,6 +1019,41 @@
       </w:r>
     </w:p>
     <w:p>
+      <w:r>
+        <w:t>AWS. Shared Responsibility Model. https://aws.amazon.com/compliance/shared-responsibility-model/. Acesso em 05 set. 2026.</w:t>
+      </w:r>
+    </w:p>
+    <w:p>
+      <w:r>
+        <w:t>AWS. EBS volume constraints. https://docs.aws.amazon.com/ebs/latest/userguide/volume_constraints.html. Acesso em 05 set. 2026.</w:t>
+      </w:r>
+    </w:p>
+    <w:p>
+      <w:r>
+        <w:t>AWS. Aurora quotas and limits. https://docs.aws.amazon.com/AmazonRDS/latest/AuroraUserGuide/CHAP_Limits.html. Acesso em 05 set. 2026.</w:t>
+      </w:r>
+    </w:p>
+    <w:p>
+      <w:r>
+        <w:t>AWS. What is Amazon EFS? https://docs.aws.amazon.com/efs/latest/ug/whatisefs.html. Acesso em 05 set. 2026.</w:t>
+      </w:r>
+    </w:p>
+    <w:p>
+      <w:r>
+        <w:t>AWS. Amazon Athena Pricing. https://aws.amazon.com/athena/pricing/. Acesso em 05 set. 2026.</w:t>
+      </w:r>
+    </w:p>
+    <w:p>
+      <w:r>
+        <w:t>AWS. Amazon S3 Pricing. https://aws.amazon.com/s3/pricing/. Acesso em 05 set. 2026.</w:t>
+      </w:r>
+    </w:p>
+    <w:p>
+      <w:r>
+        <w:t>NIST. SP 800-145: The NIST Definition of Cloud Computing. https://csrc.nist.gov/pubs/sp/800/145/final. Acesso em 05 set. 2026.</w:t>
+      </w:r>
+    </w:p>
+    <w:p>
       <w:pPr>
         <w:spacing w:after="120"/>
       </w:pPr>
@@ -944,12 +1174,7 @@
         <w:jc w:val="both"/>
       </w:pPr>
       <w:r>
-        <w:rPr>
-          <w:rFonts w:ascii="Calibri" w:cs="Calibri" w:eastAsia="Calibri" w:hAnsi="Calibri"/>
-          <w:sz w:val="22"/>
-          <w:szCs w:val="22"/>
-        </w:rPr>
-        <w:t xml:space="preserve">Cloud Storage (armazenamento em nuvem) é o subconjunto da computação em nuvem responsável por armazenar dados em servidores remotos, geralmente replicados em múltiplos discos e, muitas vezes, em múltiplas zonas de disponibilidade ou regiões geográficas, sendo acessados pela Internet por meio de APIs. Diferentemente do armazenamento local (discos e storages on-premises), o armazenamento em nuvem abstrai a infraestrutura física: o cliente não sabe (nem precisa saber) em qual disco físico seus dados residem, apenas contrata uma capacidade e uma classe de serviço com determinadas garantias de durabilidade, disponibilidade e desempenho.</w:t>
+        <w:t>Cloud Storage é a família de serviços que persiste dados abstraindo parte da infraestrutura física. Inclui objetos (S3), blocos (EBS), arquivos (EFS), classes de arquivamento (S3 Glacier) e armazenamento gerenciado de bancos/warehouses. O acesso pode ocorrer por Internet, VPN, Direct Connect ou endpoints privados. Semântica, durabilidade, disponibilidade, latência e responsabilidade variam por serviço.</w:t>
       </w:r>
     </w:p>
     <w:p>
@@ -1021,12 +1246,7 @@
         <w:spacing w:after="90" w:line="280"/>
       </w:pPr>
       <w:r>
-        <w:rPr>
-          <w:rFonts w:ascii="Calibri" w:cs="Calibri" w:eastAsia="Calibri" w:hAnsi="Calibri"/>
-          <w:sz w:val="22"/>
-          <w:szCs w:val="22"/>
-        </w:rPr>
-        <w:t xml:space="preserve">SaaS (Software as a Service) — o provedor entrega o software pronto para uso final, via navegador ou aplicativo, sem que o cliente gerencie qualquer camada de infraestrutura. Exemplo: Gmail, Microsoft 365.</w:t>
+        <w:t>SaaS (Software as a Service) — aplicação completa operada pelo provedor; o cliente ainda administra usuários, conteúdo, classificação e configurações permitidas. Exemplo no ecossistema AWS: Amazon QuickSight.</w:t>
       </w:r>
     </w:p>
     <w:p>
@@ -1039,12 +1259,7 @@
         <w:spacing w:after="90" w:line="280"/>
       </w:pPr>
       <w:r>
-        <w:rPr>
-          <w:rFonts w:ascii="Calibri" w:cs="Calibri" w:eastAsia="Calibri" w:hAnsi="Calibri"/>
-          <w:sz w:val="22"/>
-          <w:szCs w:val="22"/>
-        </w:rPr>
-        <w:t xml:space="preserve">DBaaS (Database as a Service) — modelo especializado em que o provedor gerencia integralmente a operação de um banco de dados (instalação, backup, replicação, failover, patches), deixando ao cliente apenas o modelo de dados e as consultas. Exemplo: Amazon RDS.</w:t>
+        <w:t>DBaaS (Database as a Service) — o provedor opera infraestrutura, engine e tarefas gerenciadas conforme a modalidade; o cliente continua responsável por dados, esquema, consultas, IAM/credenciais, classificação e configurações disponíveis. Exemplo: Amazon RDS.</w:t>
       </w:r>
     </w:p>
     <w:p>
@@ -1057,12 +1272,7 @@
         <w:spacing w:after="90" w:line="280"/>
       </w:pPr>
       <w:r>
-        <w:rPr>
-          <w:rFonts w:ascii="Calibri" w:cs="Calibri" w:eastAsia="Calibri" w:hAnsi="Calibri"/>
-          <w:sz w:val="22"/>
-          <w:szCs w:val="22"/>
-        </w:rPr>
-        <w:t xml:space="preserve">DWaaS (Data Warehouse as a Service) — variação do DBaaS voltada para cargas analíticas (OLAP) de grande volume, com armazenamento colunar, processamento massivamente paralelo (MPP) e integração nativa com ferramentas de BI. Exemplo: Amazon Redshift.</w:t>
+        <w:t>DWaaS (Data Warehouse as a Service) — serviço analítico gerenciado com armazenamento colunar/MPP. Comparado a um DW autogerenciado em EC2, transfere ao provedor engine e infraestrutura, mas mantém com o cliente dados, modelo, cargas, consultas, acesso e governança. Exemplo: Amazon Redshift.</w:t>
       </w:r>
     </w:p>
     <w:p>
@@ -1115,19 +1325,8 @@
             <w:vAlign w:val="center"/>
           </w:tcPr>
           <w:p>
-            <w:pPr>
-              <w:jc w:val="left"/>
-            </w:pPr>
-            <w:r>
-              <w:rPr>
-                <w:rFonts w:ascii="Calibri" w:cs="Calibri" w:eastAsia="Calibri" w:hAnsi="Calibri"/>
-                <w:b/>
-                <w:bCs/>
-                <w:color w:val="FFFFFF"/>
-                <w:sz w:val="20"/>
-                <w:szCs w:val="20"/>
-              </w:rPr>
-              <w:t xml:space="preserve">Camada</w:t>
+            <w:r>
+              <w:t>Camada</w:t>
             </w:r>
           </w:p>
         </w:tc>
@@ -1144,19 +1343,8 @@
             <w:vAlign w:val="center"/>
           </w:tcPr>
           <w:p>
-            <w:pPr>
-              <w:jc w:val="left"/>
-            </w:pPr>
-            <w:r>
-              <w:rPr>
-                <w:rFonts w:ascii="Calibri" w:cs="Calibri" w:eastAsia="Calibri" w:hAnsi="Calibri"/>
-                <w:b/>
-                <w:bCs/>
-                <w:color w:val="FFFFFF"/>
-                <w:sz w:val="20"/>
-                <w:szCs w:val="20"/>
-              </w:rPr>
-              <w:t xml:space="preserve">IaaS</w:t>
+            <w:r>
+              <w:t>IaaS</w:t>
             </w:r>
           </w:p>
         </w:tc>
@@ -1173,19 +1361,8 @@
             <w:vAlign w:val="center"/>
           </w:tcPr>
           <w:p>
-            <w:pPr>
-              <w:jc w:val="left"/>
-            </w:pPr>
-            <w:r>
-              <w:rPr>
-                <w:rFonts w:ascii="Calibri" w:cs="Calibri" w:eastAsia="Calibri" w:hAnsi="Calibri"/>
-                <w:b/>
-                <w:bCs/>
-                <w:color w:val="FFFFFF"/>
-                <w:sz w:val="20"/>
-                <w:szCs w:val="20"/>
-              </w:rPr>
-              <w:t xml:space="preserve">PaaS</w:t>
+            <w:r>
+              <w:t>PaaS</w:t>
             </w:r>
           </w:p>
         </w:tc>
@@ -1202,19 +1379,8 @@
             <w:vAlign w:val="center"/>
           </w:tcPr>
           <w:p>
-            <w:pPr>
-              <w:jc w:val="left"/>
-            </w:pPr>
-            <w:r>
-              <w:rPr>
-                <w:rFonts w:ascii="Calibri" w:cs="Calibri" w:eastAsia="Calibri" w:hAnsi="Calibri"/>
-                <w:b/>
-                <w:bCs/>
-                <w:color w:val="FFFFFF"/>
-                <w:sz w:val="20"/>
-                <w:szCs w:val="20"/>
-              </w:rPr>
-              <w:t xml:space="preserve">SaaS</w:t>
+            <w:r>
+              <w:t>SaaS</w:t>
             </w:r>
           </w:p>
         </w:tc>
@@ -1231,19 +1397,8 @@
             <w:vAlign w:val="center"/>
           </w:tcPr>
           <w:p>
-            <w:pPr>
-              <w:jc w:val="left"/>
-            </w:pPr>
-            <w:r>
-              <w:rPr>
-                <w:rFonts w:ascii="Calibri" w:cs="Calibri" w:eastAsia="Calibri" w:hAnsi="Calibri"/>
-                <w:b/>
-                <w:bCs/>
-                <w:color w:val="FFFFFF"/>
-                <w:sz w:val="20"/>
-                <w:szCs w:val="20"/>
-              </w:rPr>
-              <w:t xml:space="preserve">DBaaS/DWaaS</w:t>
+            <w:r>
+              <w:t>DBaaS/DWaaS</w:t>
             </w:r>
           </w:p>
         </w:tc>
@@ -1262,19 +1417,8 @@
             <w:vAlign w:val="center"/>
           </w:tcPr>
           <w:p>
-            <w:pPr>
-              <w:jc w:val="left"/>
-            </w:pPr>
-            <w:r>
-              <w:rPr>
-                <w:rFonts w:ascii="Calibri" w:cs="Calibri" w:eastAsia="Calibri" w:hAnsi="Calibri"/>
-                <w:b w:val="false"/>
-                <w:bCs w:val="false"/>
-                <w:color w:val="000000"/>
-                <w:sz w:val="20"/>
-                <w:szCs w:val="20"/>
-              </w:rPr>
-              <w:t xml:space="preserve">Aplicação</w:t>
+            <w:r>
+              <w:t>Aplicação/código/consultas</w:t>
             </w:r>
           </w:p>
         </w:tc>
@@ -1291,19 +1435,8 @@
             <w:vAlign w:val="center"/>
           </w:tcPr>
           <w:p>
-            <w:pPr>
-              <w:jc w:val="left"/>
-            </w:pPr>
-            <w:r>
-              <w:rPr>
-                <w:rFonts w:ascii="Calibri" w:cs="Calibri" w:eastAsia="Calibri" w:hAnsi="Calibri"/>
-                <w:b w:val="false"/>
-                <w:bCs w:val="false"/>
-                <w:color w:val="000000"/>
-                <w:sz w:val="20"/>
-                <w:szCs w:val="20"/>
-              </w:rPr>
-              <w:t xml:space="preserve">Cliente</w:t>
+            <w:r>
+              <w:t>Cliente</w:t>
             </w:r>
           </w:p>
         </w:tc>
@@ -1320,19 +1453,8 @@
             <w:vAlign w:val="center"/>
           </w:tcPr>
           <w:p>
-            <w:pPr>
-              <w:jc w:val="left"/>
-            </w:pPr>
-            <w:r>
-              <w:rPr>
-                <w:rFonts w:ascii="Calibri" w:cs="Calibri" w:eastAsia="Calibri" w:hAnsi="Calibri"/>
-                <w:b w:val="false"/>
-                <w:bCs w:val="false"/>
-                <w:color w:val="000000"/>
-                <w:sz w:val="20"/>
-                <w:szCs w:val="20"/>
-              </w:rPr>
-              <w:t xml:space="preserve">Cliente</w:t>
+            <w:r>
+              <w:t>Cliente</w:t>
             </w:r>
           </w:p>
         </w:tc>
@@ -1349,19 +1471,8 @@
             <w:vAlign w:val="center"/>
           </w:tcPr>
           <w:p>
-            <w:pPr>
-              <w:jc w:val="left"/>
-            </w:pPr>
-            <w:r>
-              <w:rPr>
-                <w:rFonts w:ascii="Calibri" w:cs="Calibri" w:eastAsia="Calibri" w:hAnsi="Calibri"/>
-                <w:b w:val="false"/>
-                <w:bCs w:val="false"/>
-                <w:color w:val="000000"/>
-                <w:sz w:val="20"/>
-                <w:szCs w:val="20"/>
-              </w:rPr>
-              <w:t xml:space="preserve">Provedor</w:t>
+            <w:r>
+              <w:t>Provedor; cliente configura/usa</w:t>
             </w:r>
           </w:p>
         </w:tc>
@@ -1378,19 +1489,8 @@
             <w:vAlign w:val="center"/>
           </w:tcPr>
           <w:p>
-            <w:pPr>
-              <w:jc w:val="left"/>
-            </w:pPr>
-            <w:r>
-              <w:rPr>
-                <w:rFonts w:ascii="Calibri" w:cs="Calibri" w:eastAsia="Calibri" w:hAnsi="Calibri"/>
-                <w:b w:val="false"/>
-                <w:bCs w:val="false"/>
-                <w:color w:val="000000"/>
-                <w:sz w:val="20"/>
-                <w:szCs w:val="20"/>
-              </w:rPr>
-              <w:t xml:space="preserve">Cliente (consultas)</w:t>
+            <w:r>
+              <w:t>Cliente: esquema, cargas e consultas</w:t>
             </w:r>
           </w:p>
         </w:tc>
@@ -1409,19 +1509,8 @@
             <w:vAlign w:val="center"/>
           </w:tcPr>
           <w:p>
-            <w:pPr>
-              <w:jc w:val="left"/>
-            </w:pPr>
-            <w:r>
-              <w:rPr>
-                <w:rFonts w:ascii="Calibri" w:cs="Calibri" w:eastAsia="Calibri" w:hAnsi="Calibri"/>
-                <w:b w:val="false"/>
-                <w:bCs w:val="false"/>
-                <w:color w:val="000000"/>
-                <w:sz w:val="20"/>
-                <w:szCs w:val="20"/>
-              </w:rPr>
-              <w:t xml:space="preserve">Dados / Runtime</w:t>
+            <w:r>
+              <w:t>Dados, IAM e governança</w:t>
             </w:r>
           </w:p>
         </w:tc>
@@ -1438,19 +1527,8 @@
             <w:vAlign w:val="center"/>
           </w:tcPr>
           <w:p>
-            <w:pPr>
-              <w:jc w:val="left"/>
-            </w:pPr>
-            <w:r>
-              <w:rPr>
-                <w:rFonts w:ascii="Calibri" w:cs="Calibri" w:eastAsia="Calibri" w:hAnsi="Calibri"/>
-                <w:b w:val="false"/>
-                <w:bCs w:val="false"/>
-                <w:color w:val="000000"/>
-                <w:sz w:val="20"/>
-                <w:szCs w:val="20"/>
-              </w:rPr>
-              <w:t xml:space="preserve">Cliente</w:t>
+            <w:r>
+              <w:t>Cliente</w:t>
             </w:r>
           </w:p>
         </w:tc>
@@ -1467,19 +1545,8 @@
             <w:vAlign w:val="center"/>
           </w:tcPr>
           <w:p>
-            <w:pPr>
-              <w:jc w:val="left"/>
-            </w:pPr>
-            <w:r>
-              <w:rPr>
-                <w:rFonts w:ascii="Calibri" w:cs="Calibri" w:eastAsia="Calibri" w:hAnsi="Calibri"/>
-                <w:b w:val="false"/>
-                <w:bCs w:val="false"/>
-                <w:color w:val="000000"/>
-                <w:sz w:val="20"/>
-                <w:szCs w:val="20"/>
-              </w:rPr>
-              <w:t xml:space="preserve">Provedor</w:t>
+            <w:r>
+              <w:t>Cliente</w:t>
             </w:r>
           </w:p>
         </w:tc>
@@ -1496,19 +1563,8 @@
             <w:vAlign w:val="center"/>
           </w:tcPr>
           <w:p>
-            <w:pPr>
-              <w:jc w:val="left"/>
-            </w:pPr>
-            <w:r>
-              <w:rPr>
-                <w:rFonts w:ascii="Calibri" w:cs="Calibri" w:eastAsia="Calibri" w:hAnsi="Calibri"/>
-                <w:b w:val="false"/>
-                <w:bCs w:val="false"/>
-                <w:color w:val="000000"/>
-                <w:sz w:val="20"/>
-                <w:szCs w:val="20"/>
-              </w:rPr>
-              <w:t xml:space="preserve">Provedor</w:t>
+            <w:r>
+              <w:t>Cliente para seu conteúdo/acesso</w:t>
             </w:r>
           </w:p>
         </w:tc>
@@ -1525,19 +1581,8 @@
             <w:vAlign w:val="center"/>
           </w:tcPr>
           <w:p>
-            <w:pPr>
-              <w:jc w:val="left"/>
-            </w:pPr>
-            <w:r>
-              <w:rPr>
-                <w:rFonts w:ascii="Calibri" w:cs="Calibri" w:eastAsia="Calibri" w:hAnsi="Calibri"/>
-                <w:b w:val="false"/>
-                <w:bCs w:val="false"/>
-                <w:color w:val="000000"/>
-                <w:sz w:val="20"/>
-                <w:szCs w:val="20"/>
-              </w:rPr>
-              <w:t xml:space="preserve">Provedor</w:t>
+            <w:r>
+              <w:t>Cliente</w:t>
             </w:r>
           </w:p>
         </w:tc>
@@ -1556,19 +1601,8 @@
             <w:vAlign w:val="center"/>
           </w:tcPr>
           <w:p>
-            <w:pPr>
-              <w:jc w:val="left"/>
-            </w:pPr>
-            <w:r>
-              <w:rPr>
-                <w:rFonts w:ascii="Calibri" w:cs="Calibri" w:eastAsia="Calibri" w:hAnsi="Calibri"/>
-                <w:b w:val="false"/>
-                <w:bCs w:val="false"/>
-                <w:color w:val="000000"/>
-                <w:sz w:val="20"/>
-                <w:szCs w:val="20"/>
-              </w:rPr>
-              <w:t xml:space="preserve">SO / Middleware</w:t>
+            <w:r>
+              <w:t>Runtime/engine, SO e middleware</w:t>
             </w:r>
           </w:p>
         </w:tc>
@@ -1585,19 +1619,8 @@
             <w:vAlign w:val="center"/>
           </w:tcPr>
           <w:p>
-            <w:pPr>
-              <w:jc w:val="left"/>
-            </w:pPr>
-            <w:r>
-              <w:rPr>
-                <w:rFonts w:ascii="Calibri" w:cs="Calibri" w:eastAsia="Calibri" w:hAnsi="Calibri"/>
-                <w:b w:val="false"/>
-                <w:bCs w:val="false"/>
-                <w:color w:val="000000"/>
-                <w:sz w:val="20"/>
-                <w:szCs w:val="20"/>
-              </w:rPr>
-              <w:t xml:space="preserve">Cliente</w:t>
+            <w:r>
+              <w:t>Cliente</w:t>
             </w:r>
           </w:p>
         </w:tc>
@@ -1614,19 +1637,8 @@
             <w:vAlign w:val="center"/>
           </w:tcPr>
           <w:p>
-            <w:pPr>
-              <w:jc w:val="left"/>
-            </w:pPr>
-            <w:r>
-              <w:rPr>
-                <w:rFonts w:ascii="Calibri" w:cs="Calibri" w:eastAsia="Calibri" w:hAnsi="Calibri"/>
-                <w:b w:val="false"/>
-                <w:bCs w:val="false"/>
-                <w:color w:val="000000"/>
-                <w:sz w:val="20"/>
-                <w:szCs w:val="20"/>
-              </w:rPr>
-              <w:t xml:space="preserve">Provedor</w:t>
+            <w:r>
+              <w:t>Provedor</w:t>
             </w:r>
           </w:p>
         </w:tc>
@@ -1643,19 +1655,8 @@
             <w:vAlign w:val="center"/>
           </w:tcPr>
           <w:p>
-            <w:pPr>
-              <w:jc w:val="left"/>
-            </w:pPr>
-            <w:r>
-              <w:rPr>
-                <w:rFonts w:ascii="Calibri" w:cs="Calibri" w:eastAsia="Calibri" w:hAnsi="Calibri"/>
-                <w:b w:val="false"/>
-                <w:bCs w:val="false"/>
-                <w:color w:val="000000"/>
-                <w:sz w:val="20"/>
-                <w:szCs w:val="20"/>
-              </w:rPr>
-              <w:t xml:space="preserve">Provedor</w:t>
+            <w:r>
+              <w:t>Provedor</w:t>
             </w:r>
           </w:p>
         </w:tc>
@@ -1672,19 +1673,8 @@
             <w:vAlign w:val="center"/>
           </w:tcPr>
           <w:p>
-            <w:pPr>
-              <w:jc w:val="left"/>
-            </w:pPr>
-            <w:r>
-              <w:rPr>
-                <w:rFonts w:ascii="Calibri" w:cs="Calibri" w:eastAsia="Calibri" w:hAnsi="Calibri"/>
-                <w:b w:val="false"/>
-                <w:bCs w:val="false"/>
-                <w:color w:val="000000"/>
-                <w:sz w:val="20"/>
-                <w:szCs w:val="20"/>
-              </w:rPr>
-              <w:t xml:space="preserve">Provedor</w:t>
+            <w:r>
+              <w:t>Provedor conforme o serviço</w:t>
             </w:r>
           </w:p>
         </w:tc>
@@ -1703,19 +1693,8 @@
             <w:vAlign w:val="center"/>
           </w:tcPr>
           <w:p>
-            <w:pPr>
-              <w:jc w:val="left"/>
-            </w:pPr>
-            <w:r>
-              <w:rPr>
-                <w:rFonts w:ascii="Calibri" w:cs="Calibri" w:eastAsia="Calibri" w:hAnsi="Calibri"/>
-                <w:b w:val="false"/>
-                <w:bCs w:val="false"/>
-                <w:color w:val="000000"/>
-                <w:sz w:val="20"/>
-                <w:szCs w:val="20"/>
-              </w:rPr>
-              <w:t xml:space="preserve">Virtualização / Infra</w:t>
+            <w:r>
+              <w:t>Virtualização/infra física</w:t>
             </w:r>
           </w:p>
         </w:tc>
@@ -1732,19 +1711,8 @@
             <w:vAlign w:val="center"/>
           </w:tcPr>
           <w:p>
-            <w:pPr>
-              <w:jc w:val="left"/>
-            </w:pPr>
-            <w:r>
-              <w:rPr>
-                <w:rFonts w:ascii="Calibri" w:cs="Calibri" w:eastAsia="Calibri" w:hAnsi="Calibri"/>
-                <w:b w:val="false"/>
-                <w:bCs w:val="false"/>
-                <w:color w:val="000000"/>
-                <w:sz w:val="20"/>
-                <w:szCs w:val="20"/>
-              </w:rPr>
-              <w:t xml:space="preserve">Provedor</w:t>
+            <w:r>
+              <w:t>Provedor</w:t>
             </w:r>
           </w:p>
         </w:tc>
@@ -1761,19 +1729,8 @@
             <w:vAlign w:val="center"/>
           </w:tcPr>
           <w:p>
-            <w:pPr>
-              <w:jc w:val="left"/>
-            </w:pPr>
-            <w:r>
-              <w:rPr>
-                <w:rFonts w:ascii="Calibri" w:cs="Calibri" w:eastAsia="Calibri" w:hAnsi="Calibri"/>
-                <w:b w:val="false"/>
-                <w:bCs w:val="false"/>
-                <w:color w:val="000000"/>
-                <w:sz w:val="20"/>
-                <w:szCs w:val="20"/>
-              </w:rPr>
-              <w:t xml:space="preserve">Provedor</w:t>
+            <w:r>
+              <w:t>Provedor</w:t>
             </w:r>
           </w:p>
         </w:tc>
@@ -1790,19 +1747,8 @@
             <w:vAlign w:val="center"/>
           </w:tcPr>
           <w:p>
-            <w:pPr>
-              <w:jc w:val="left"/>
-            </w:pPr>
-            <w:r>
-              <w:rPr>
-                <w:rFonts w:ascii="Calibri" w:cs="Calibri" w:eastAsia="Calibri" w:hAnsi="Calibri"/>
-                <w:b w:val="false"/>
-                <w:bCs w:val="false"/>
-                <w:color w:val="000000"/>
-                <w:sz w:val="20"/>
-                <w:szCs w:val="20"/>
-              </w:rPr>
-              <w:t xml:space="preserve">Provedor</w:t>
+            <w:r>
+              <w:t>Provedor</w:t>
             </w:r>
           </w:p>
         </w:tc>
@@ -1819,19 +1765,8 @@
             <w:vAlign w:val="center"/>
           </w:tcPr>
           <w:p>
-            <w:pPr>
-              <w:jc w:val="left"/>
-            </w:pPr>
-            <w:r>
-              <w:rPr>
-                <w:rFonts w:ascii="Calibri" w:cs="Calibri" w:eastAsia="Calibri" w:hAnsi="Calibri"/>
-                <w:b w:val="false"/>
-                <w:bCs w:val="false"/>
-                <w:color w:val="000000"/>
-                <w:sz w:val="20"/>
-                <w:szCs w:val="20"/>
-              </w:rPr>
-              <w:t xml:space="preserve">Provedor</w:t>
+            <w:r>
+              <w:t>Provedor</w:t>
             </w:r>
           </w:p>
         </w:tc>
@@ -1869,6 +1804,15 @@
         <w:jc w:val="both"/>
       </w:pPr>
       <w:r>
+        <w:t>Nuvem pública: infraestrutura operada por provedor para múltiplos clientes, com isolamento lógico e serviços padronizados. A classificação decorre de propriedade/operação/tenancy, não da obrigação de usar Internet pública: VPN, Direct Connect e endpoints privados também podem ser usados.</w:t>
+      </w:r>
+    </w:p>
+    <w:p>
+      <w:pPr>
+        <w:spacing w:after="160" w:line="300"/>
+        <w:jc w:val="both"/>
+      </w:pPr>
+      <w:r>
         <w:rPr>
           <w:rFonts w:ascii="Calibri" w:cs="Calibri" w:eastAsia="Calibri" w:hAnsi="Calibri"/>
           <w:b/>
@@ -1876,7 +1820,7 @@
           <w:sz w:val="22"/>
           <w:szCs w:val="22"/>
         </w:rPr>
-        <w:t xml:space="preserve">Nuvem pública: </w:t>
+        <w:t xml:space="preserve">Nuvem privada: </w:t>
       </w:r>
       <w:r>
         <w:rPr>
@@ -1884,7 +1828,7 @@
           <w:sz w:val="22"/>
           <w:szCs w:val="22"/>
         </w:rPr>
-        <w:t xml:space="preserve">infraestrutura de propriedade de um provedor terceirizado (ex.: AWS, Azure, GCP), compartilhada entre múltiplos clientes (multi-tenant), acessada via Internet. Vantagens: baixo custo inicial, elasticidade, ampla gama de serviços gerenciados. Desvantagens: menor controle sobre a infraestrutura física e potenciais preocupações de conformidade regulatória em setores sensíveis.</w:t>
+        <w:t xml:space="preserve">infraestrutura dedicada a uma única organização, hospedada no próprio data center ou por um provedor terceirizado, mas de uso exclusivo. Vantagens: maior controle, isolamento e customização de segurança. Desvantagens: custo de capital mais alto e menor elasticidade quando comparada à nuvem pública.</w:t>
       </w:r>
     </w:p>
     <w:p>
@@ -1900,7 +1844,7 @@
           <w:sz w:val="22"/>
           <w:szCs w:val="22"/>
         </w:rPr>
-        <w:t xml:space="preserve">Nuvem privada: </w:t>
+        <w:t xml:space="preserve">Nuvem híbrida: </w:t>
       </w:r>
       <w:r>
         <w:rPr>
@@ -1908,7 +1852,16 @@
           <w:sz w:val="22"/>
           <w:szCs w:val="22"/>
         </w:rPr>
-        <w:t xml:space="preserve">infraestrutura dedicada a uma única organização, hospedada no próprio data center ou por um provedor terceirizado, mas de uso exclusivo. Vantagens: maior controle, isolamento e customização de segurança. Desvantagens: custo de capital mais alto e menor elasticidade quando comparada à nuvem pública.</w:t>
+        <w:t xml:space="preserve">combinação de nuvem pública e privada (ou infraestrutura on-premises), com orquestração e portabilidade de dados/aplicações entre os dois ambientes. É comum, por exemplo, manter dados sensíveis em nuvem privada e usar a nuvem pública para picos de processamento (cloud bursting) ou para cargas analíticas menos sensíveis.</w:t>
+      </w:r>
+    </w:p>
+    <w:p>
+      <w:pPr>
+        <w:pStyle w:val="Heading1"/>
+        <w:spacing w:after="200" w:before="360"/>
+      </w:pPr>
+      <w:r>
+        <w:t xml:space="preserve">6. Características Fundamentais da Computação em Nuvem</w:t>
       </w:r>
     </w:p>
     <w:p>
@@ -1916,32 +1869,22 @@
         <w:spacing w:after="160" w:line="300"/>
         <w:jc w:val="both"/>
       </w:pPr>
-      <w:r>
-        <w:rPr>
-          <w:rFonts w:ascii="Calibri" w:cs="Calibri" w:eastAsia="Calibri" w:hAnsi="Calibri"/>
-          <w:b/>
-          <w:bCs/>
-          <w:sz w:val="22"/>
-          <w:szCs w:val="22"/>
-        </w:rPr>
-        <w:t xml:space="preserve">Nuvem híbrida: </w:t>
-      </w:r>
       <w:r>
         <w:rPr>
           <w:rFonts w:ascii="Calibri" w:cs="Calibri" w:eastAsia="Calibri" w:hAnsi="Calibri"/>
           <w:sz w:val="22"/>
           <w:szCs w:val="22"/>
         </w:rPr>
-        <w:t xml:space="preserve">combinação de nuvem pública e privada (ou infraestrutura on-premises), com orquestração e portabilidade de dados/aplicações entre os dois ambientes. É comum, por exemplo, manter dados sensíveis em nuvem privada e usar a nuvem pública para picos de processamento (cloud bursting) ou para cargas analíticas menos sensíveis.</w:t>
-      </w:r>
-    </w:p>
-    <w:p>
-      <w:pPr>
-        <w:pStyle w:val="Heading1"/>
-        <w:spacing w:after="200" w:before="360"/>
-      </w:pPr>
-      <w:r>
-        <w:t xml:space="preserve">6. Características Fundamentais da Computação em Nuvem</w:t>
+        <w:t xml:space="preserve">Para avaliar e comparar provedores e serviços de nuvem, alguns atributos são especialmente relevantes:</w:t>
+      </w:r>
+    </w:p>
+    <w:p>
+      <w:pPr>
+        <w:pStyle w:val="Heading3"/>
+        <w:spacing w:after="120" w:before="200"/>
+      </w:pPr>
+      <w:r>
+        <w:t xml:space="preserve">6.1 Acessibilidade e Disponibilidade</w:t>
       </w:r>
     </w:p>
     <w:p>
@@ -1955,7 +1898,7 @@
           <w:sz w:val="22"/>
           <w:szCs w:val="22"/>
         </w:rPr>
-        <w:t xml:space="preserve">Para avaliar e comparar provedores e serviços de nuvem, alguns atributos são especialmente relevantes:</w:t>
+        <w:t xml:space="preserve">Acessibilidade refere-se à facilidade de acesso aos recursos a partir de qualquer lugar com conexão à Internet, por meio de APIs, consoles web, linhas de comando e SDKs. Disponibilidade (availability) é medida em porcentagem de tempo em que o serviço permanece operacional, geralmente expressa em SLA (Service Level Agreement) — por exemplo, 99,99% de disponibilidade equivale a pouco mais de 52 minutos de indisponibilidade tolerada por ano.</w:t>
       </w:r>
     </w:p>
     <w:p>
@@ -1964,7 +1907,7 @@
         <w:spacing w:after="120" w:before="200"/>
       </w:pPr>
       <w:r>
-        <w:t xml:space="preserve">6.1 Acessibilidade e Disponibilidade</w:t>
+        <w:t xml:space="preserve">6.2 Latência</w:t>
       </w:r>
     </w:p>
     <w:p>
@@ -1978,7 +1921,7 @@
           <w:sz w:val="22"/>
           <w:szCs w:val="22"/>
         </w:rPr>
-        <w:t xml:space="preserve">Acessibilidade refere-se à facilidade de acesso aos recursos a partir de qualquer lugar com conexão à Internet, por meio de APIs, consoles web, linhas de comando e SDKs. Disponibilidade (availability) é medida em porcentagem de tempo em que o serviço permanece operacional, geralmente expressa em SLA (Service Level Agreement) — por exemplo, 99,99% de disponibilidade equivale a pouco mais de 52 minutos de indisponibilidade tolerada por ano.</w:t>
+        <w:t xml:space="preserve">Latência é o tempo de resposta entre uma requisição e o recebimento dos dados. Depende da distância física até a região/zona de disponibilidade escolhida, do tipo de rede utilizada e da classe de armazenamento (por exemplo, dados em Glacier Deep Archive levam de 12 a 48 horas para serem recuperados, enquanto dados em S3 Standard estão disponíveis em milissegundos).</w:t>
       </w:r>
     </w:p>
     <w:p>
@@ -1987,7 +1930,25 @@
         <w:spacing w:after="120" w:before="200"/>
       </w:pPr>
       <w:r>
-        <w:t xml:space="preserve">6.2 Latência</w:t>
+        <w:t xml:space="preserve">6.3 Escalabilidade</w:t>
+      </w:r>
+    </w:p>
+    <w:p>
+      <w:pPr>
+        <w:spacing w:after="160" w:line="300"/>
+        <w:jc w:val="both"/>
+      </w:pPr>
+      <w:r>
+        <w:t>Escalabilidade é a capacidade de suportar crescimento vertical ou horizontal. Elasticidade é ajustar recursos rapidamente — idealmente de forma automática — para acompanhar aumento e redução da demanda. Um sistema pode ser escalável sem ser elástico.</w:t>
+      </w:r>
+    </w:p>
+    <w:p>
+      <w:pPr>
+        <w:pStyle w:val="Heading3"/>
+        <w:spacing w:after="120" w:before="200"/>
+      </w:pPr>
+      <w:r>
+        <w:t xml:space="preserve">6.4 Confiabilidade e Durabilidade</w:t>
       </w:r>
     </w:p>
     <w:p>
@@ -2001,7 +1962,7 @@
           <w:sz w:val="22"/>
           <w:szCs w:val="22"/>
         </w:rPr>
-        <w:t xml:space="preserve">Latência é o tempo de resposta entre uma requisição e o recebimento dos dados. Depende da distância física até a região/zona de disponibilidade escolhida, do tipo de rede utilizada e da classe de armazenamento (por exemplo, dados em Glacier Deep Archive levam de 12 a 48 horas para serem recuperados, enquanto dados em S3 Standard estão disponíveis em milissegundos).</w:t>
+        <w:t xml:space="preserve">Confiabilidade envolve a capacidade do sistema de operar corretamente e se recuperar de falhas, geralmente por meio de redundância (múltiplas cópias dos dados em diferentes discos, zonas e, eventualmente, regiões). A durabilidade dos dados no Amazon S3 Standard, por exemplo, é de 99,999999999% (11 noves), o que significa uma probabilidade extremamente baixa de perda de um objeto armazenado.</w:t>
       </w:r>
     </w:p>
     <w:p>
@@ -2010,7 +1971,7 @@
         <w:spacing w:after="120" w:before="200"/>
       </w:pPr>
       <w:r>
-        <w:t xml:space="preserve">6.3 Escalabilidade</w:t>
+        <w:t xml:space="preserve">6.5 Segurança</w:t>
       </w:r>
     </w:p>
     <w:p>
@@ -2024,7 +1985,7 @@
           <w:sz w:val="22"/>
           <w:szCs w:val="22"/>
         </w:rPr>
-        <w:t xml:space="preserve">Escalabilidade é a capacidade de aumentar (scale up/out) ou reduzir (scale down/in) recursos computacionais de forma dinâmica, de acordo com a demanda, sem interrupção do serviço. Pode ser vertical (aumentar a capacidade de uma máquina) ou horizontal (adicionar mais máquinas).</w:t>
+        <w:t xml:space="preserve">Segurança em nuvem envolve criptografia de dados em trânsito e em repouso, controle de acesso baseado em identidade (IAM), segmentação de rede (VPCs), auditoria (logs de acesso) e conformidade com normas e regulamentações (LGPD, GDPR, ISO 27001, entre outras). É importante destacar o modelo de responsabilidade compartilhada: o provedor é responsável pela segurança da nuvem (infraestrutura física, virtualização), enquanto o cliente é responsável pela segurança na nuvem (configuração de permissões, criptografia de dados próprios, gestão de credenciais).</w:t>
       </w:r>
     </w:p>
     <w:p>
@@ -2033,7 +1994,7 @@
         <w:spacing w:after="120" w:before="200"/>
       </w:pPr>
       <w:r>
-        <w:t xml:space="preserve">6.4 Confiabilidade e Durabilidade</w:t>
+        <w:t xml:space="preserve">6.6 Custo</w:t>
       </w:r>
     </w:p>
     <w:p>
@@ -2047,16 +2008,21 @@
           <w:sz w:val="22"/>
           <w:szCs w:val="22"/>
         </w:rPr>
-        <w:t xml:space="preserve">Confiabilidade envolve a capacidade do sistema de operar corretamente e se recuperar de falhas, geralmente por meio de redundância (múltiplas cópias dos dados em diferentes discos, zonas e, eventualmente, regiões). A durabilidade dos dados no Amazon S3 Standard, por exemplo, é de 99,999999999% (11 noves), o que significa uma probabilidade extremamente baixa de perda de um objeto armazenado.</w:t>
-      </w:r>
-    </w:p>
-    <w:p>
-      <w:pPr>
-        <w:pStyle w:val="Heading3"/>
-        <w:spacing w:after="120" w:before="200"/>
-      </w:pPr>
-      <w:r>
-        <w:t xml:space="preserve">6.5 Segurança</w:t>
+        <w:t xml:space="preserve">O modelo de custo em nuvem é tipicamente pay-as-you-go (paga-se pelo uso), com cobrança granular por diversas dimensões — armazenamento, computação, número de requisições, transferência de dados (egress), entre outras. Isso elimina investimento inicial em hardware, mas exige monitoramento constante (FinOps) para evitar surpresas na fatura, especialmente em cargas de grande volume, como será discutido na Seção 8.</w:t>
+      </w:r>
+    </w:p>
+    <w:p>
+      <w:r>
+        <w:br w:type="page"/>
+      </w:r>
+    </w:p>
+    <w:p>
+      <w:pPr>
+        <w:pStyle w:val="Heading1"/>
+        <w:spacing w:after="200" w:before="360"/>
+      </w:pPr>
+      <w:r>
+        <w:t xml:space="preserve">7. Estudo de Caso: Amazon Web Services (AWS)</w:t>
       </w:r>
     </w:p>
     <w:p>
@@ -2070,16 +2036,16 @@
           <w:sz w:val="22"/>
           <w:szCs w:val="22"/>
         </w:rPr>
-        <w:t xml:space="preserve">Segurança em nuvem envolve criptografia de dados em trânsito e em repouso, controle de acesso baseado em identidade (IAM), segmentação de rede (VPCs), auditoria (logs de acesso) e conformidade com normas e regulamentações (LGPD, GDPR, ISO 27001, entre outras). É importante destacar o modelo de responsabilidade compartilhada: o provedor é responsável pela segurança da nuvem (infraestrutura física, virtualização), enquanto o cliente é responsável pela segurança na nuvem (configuração de permissões, criptografia de dados próprios, gestão de credenciais).</w:t>
-      </w:r>
-    </w:p>
-    <w:p>
-      <w:pPr>
-        <w:pStyle w:val="Heading3"/>
-        <w:spacing w:after="120" w:before="200"/>
-      </w:pPr>
-      <w:r>
-        <w:t xml:space="preserve">6.6 Custo</w:t>
+        <w:t xml:space="preserve">A Amazon Web Services (AWS), lançada em 2006, é atualmente uma das maiores e mais completas plataformas de nuvem pública do mundo, oferecendo mais de 200 serviços em áreas como computação, armazenamento, bancos de dados, redes, machine learning, analytics e IoT. A seguir, descrevem-se os serviços indicados no roteiro da tarefa.</w:t>
+      </w:r>
+    </w:p>
+    <w:p>
+      <w:pPr>
+        <w:pStyle w:val="Heading2"/>
+        <w:spacing w:after="160" w:before="280"/>
+      </w:pPr>
+      <w:r>
+        <w:t xml:space="preserve">7.1 Computação — Amazon EC2</w:t>
       </w:r>
     </w:p>
     <w:p>
@@ -2088,63 +2054,7 @@
         <w:jc w:val="both"/>
       </w:pPr>
       <w:r>
-        <w:rPr>
-          <w:rFonts w:ascii="Calibri" w:cs="Calibri" w:eastAsia="Calibri" w:hAnsi="Calibri"/>
-          <w:sz w:val="22"/>
-          <w:szCs w:val="22"/>
-        </w:rPr>
-        <w:t xml:space="preserve">O modelo de custo em nuvem é tipicamente pay-as-you-go (paga-se pelo uso), com cobrança granular por diversas dimensões — armazenamento, computação, número de requisições, transferência de dados (egress), entre outras. Isso elimina investimento inicial em hardware, mas exige monitoramento constante (FinOps) para evitar surpresas na fatura, especialmente em cargas de grande volume, como será discutido na Seção 8.</w:t>
-      </w:r>
-    </w:p>
-    <w:p>
-      <w:r>
-        <w:br w:type="page"/>
-      </w:r>
-    </w:p>
-    <w:p>
-      <w:pPr>
-        <w:pStyle w:val="Heading1"/>
-        <w:spacing w:after="200" w:before="360"/>
-      </w:pPr>
-      <w:r>
-        <w:t xml:space="preserve">7. Estudo de Caso: Amazon Web Services (AWS)</w:t>
-      </w:r>
-    </w:p>
-    <w:p>
-      <w:pPr>
-        <w:spacing w:after="160" w:line="300"/>
-        <w:jc w:val="both"/>
-      </w:pPr>
-      <w:r>
-        <w:rPr>
-          <w:rFonts w:ascii="Calibri" w:cs="Calibri" w:eastAsia="Calibri" w:hAnsi="Calibri"/>
-          <w:sz w:val="22"/>
-          <w:szCs w:val="22"/>
-        </w:rPr>
-        <w:t xml:space="preserve">A Amazon Web Services (AWS), lançada em 2006, é atualmente uma das maiores e mais completas plataformas de nuvem pública do mundo, oferecendo mais de 200 serviços em áreas como computação, armazenamento, bancos de dados, redes, machine learning, analytics e IoT. A seguir, descrevem-se os serviços indicados no roteiro da tarefa.</w:t>
-      </w:r>
-    </w:p>
-    <w:p>
-      <w:pPr>
-        <w:pStyle w:val="Heading2"/>
-        <w:spacing w:after="160" w:before="280"/>
-      </w:pPr>
-      <w:r>
-        <w:t xml:space="preserve">7.1 Computação — Amazon EC2</w:t>
-      </w:r>
-    </w:p>
-    <w:p>
-      <w:pPr>
-        <w:spacing w:after="160" w:line="300"/>
-        <w:jc w:val="both"/>
-      </w:pPr>
-      <w:r>
-        <w:rPr>
-          <w:rFonts w:ascii="Calibri" w:cs="Calibri" w:eastAsia="Calibri" w:hAnsi="Calibri"/>
-          <w:sz w:val="22"/>
-          <w:szCs w:val="22"/>
-        </w:rPr>
-        <w:t xml:space="preserve">O Amazon EC2 (Elastic Compute Cloud) é o serviço de IaaS da AWS que fornece capacidade de processamento sob demanda por meio de máquinas virtuais (instâncias). O usuário escolhe o tipo de instância (otimizada para uso geral, computação, memória, GPU, etc.), o sistema operacional e a capacidade de armazenamento associada, podendo escalar horizontalmente (Auto Scaling) e balancear carga entre instâncias (Elastic Load Balancing). Os modelos de contratação incluem instâncias sob demanda (On-Demand), reservadas (Reserved Instances, com desconto por compromisso de 1 ou 3 anos), Spot Instances (capacidade ociosa com desconto de até 90%, porém sujeita a interrupção) e Savings Plans.</w:t>
+        <w:t>O Amazon EC2 fornece instâncias virtuais sob demanda. On-Demand cobra pelo uso; Spot usa capacidade ociosa interrompível; Savings Plans oferecem desconto mediante compromisso de uso; Reserved Instances são principalmente benefício de faturamento, e somente modalidades zonais específicas incluem reserva de capacidade. Bancos autogerenciados exigem gestão do SO, engine, backup, HA e patches pelo cliente.</w:t>
       </w:r>
     </w:p>
     <w:p>
@@ -2184,12 +2094,7 @@
         <w:spacing w:after="90" w:line="280"/>
       </w:pPr>
       <w:r>
-        <w:rPr>
-          <w:rFonts w:ascii="Calibri" w:cs="Calibri" w:eastAsia="Calibri" w:hAnsi="Calibri"/>
-          <w:sz w:val="22"/>
-          <w:szCs w:val="22"/>
-        </w:rPr>
-        <w:t xml:space="preserve">Amazon EBS (Elastic Block Store): armazenamento em blocos, utilizado como "disco virtual" anexado a instâncias EC2, indicado para bancos de dados e sistemas de arquivos que exigem baixa latência e alto IOPS.</w:t>
+        <w:t>Amazon EBS (Elastic Block Store): volumes em bloco anexados a EC2, com tipos e limites próprios de capacidade/IOPS/throughput. É adequado a sistemas de arquivos e bancos autogerenciados quando a arquitetura respeita limites por volume/instância e requisitos de disponibilidade.</w:t>
       </w:r>
     </w:p>
     <w:p>
@@ -2202,12 +2107,12 @@
         <w:spacing w:after="90" w:line="280"/>
       </w:pPr>
       <w:r>
-        <w:rPr>
-          <w:rFonts w:ascii="Calibri" w:cs="Calibri" w:eastAsia="Calibri" w:hAnsi="Calibri"/>
-          <w:sz w:val="22"/>
-          <w:szCs w:val="22"/>
-        </w:rPr>
-        <w:t xml:space="preserve">Amazon S3 Glacier: classes de armazenamento de baixo custo dentro do próprio S3, voltadas para arquivamento de longo prazo e dados raramente acessados (backup, compliance), com tempos de recuperação que variam de minutos a horas.</w:t>
+        <w:t>Amazon S3 Glacier: classes de dados frios dentro do S3. Instant Retrieval mantém acesso em milissegundos; Flexible Retrieval oferece opções de minutos a horas; Deep Archive tipicamente exige 12 a 48 horas. Cada classe possui cobrança de recuperação, metadados e permanência mínima.</w:t>
+      </w:r>
+    </w:p>
+    <w:p>
+      <w:r>
+        <w:t>Amazon EFS (Elastic File System): serviço de arquivos NFS elástico e compartilhável entre múltiplos clientes. Difere de S3 (objeto/API) e EBS (bloco anexado a instância); latência, throughput e preço dependem da classe/modo.</w:t>
       </w:r>
     </w:p>
     <w:p>
@@ -2229,12 +2134,7 @@
         <w:spacing w:after="90" w:line="280"/>
       </w:pPr>
       <w:r>
-        <w:rPr>
-          <w:rFonts w:ascii="Calibri" w:cs="Calibri" w:eastAsia="Calibri" w:hAnsi="Calibri"/>
-          <w:sz w:val="22"/>
-          <w:szCs w:val="22"/>
-        </w:rPr>
-        <w:t xml:space="preserve">Amazon RDS (Relational Database Service): DBaaS gerenciado para bancos relacionais (MySQL, PostgreSQL, MariaDB, Oracle, SQL Server), automatizando backups, patches, replicação e failover.</w:t>
+        <w:t>Amazon RDS: DBaaS para engines relacionais. Backups e patches são gerenciados conforme configuração; replicação/failover automático dependem de Multi-AZ ou modalidade equivalente explicitamente contratada, não de toda instância RDS.</w:t>
       </w:r>
     </w:p>
     <w:p>
@@ -2247,12 +2147,7 @@
         <w:spacing w:after="90" w:line="280"/>
       </w:pPr>
       <w:r>
-        <w:rPr>
-          <w:rFonts w:ascii="Calibri" w:cs="Calibri" w:eastAsia="Calibri" w:hAnsi="Calibri"/>
-          <w:sz w:val="22"/>
-          <w:szCs w:val="22"/>
-        </w:rPr>
-        <w:t xml:space="preserve">Amazon Aurora: banco relacional compatível com MySQL e PostgreSQL, desenvolvido pela própria AWS, com arquitetura de armazenamento distribuído que oferece maior desempenho e disponibilidade que o RDS convencional.</w:t>
+        <w:t>Amazon Aurora: engine compatível com MySQL/PostgreSQL com armazenamento distribuído próprio. Desempenho, disponibilidade, custo e limite de cluster variam por versão, região e configuração; comparar por benchmark e SLA em vez de afirmar superioridade universal.</w:t>
       </w:r>
     </w:p>
     <w:p>
@@ -2265,12 +2160,7 @@
         <w:spacing w:after="90" w:line="280"/>
       </w:pPr>
       <w:r>
-        <w:rPr>
-          <w:rFonts w:ascii="Calibri" w:cs="Calibri" w:eastAsia="Calibri" w:hAnsi="Calibri"/>
-          <w:sz w:val="22"/>
-          <w:szCs w:val="22"/>
-        </w:rPr>
-        <w:t xml:space="preserve">Amazon DynamoDB: banco de dados NoSQL gerenciado, do tipo chave-valor/documento, com escalabilidade horizontal automática e latência de milissegundos de dois dígitos, indicado para aplicações de alta escala (e-commerce, jogos, IoT).</w:t>
+        <w:t>Amazon DynamoDB: banco NoSQL chave-valor/documento gerenciado. A AWS descreve latência de milissegundos de um dígito para a maioria das operações unitárias; desenho de chave, tamanho do item, capacidade e rede ainda determinam a latência observada.</w:t>
       </w:r>
     </w:p>
     <w:p>
@@ -2311,12 +2201,7 @@
         <w:jc w:val="both"/>
       </w:pPr>
       <w:r>
-        <w:rPr>
-          <w:rFonts w:ascii="Calibri" w:cs="Calibri" w:eastAsia="Calibri" w:hAnsi="Calibri"/>
-          <w:sz w:val="22"/>
-          <w:szCs w:val="22"/>
-        </w:rPr>
-        <w:t xml:space="preserve">Nesta seção, estima-se o custo de armazenar e processar uma base de dados de 3,5 Petabytes (PB) na AWS, discutindo-se também vantagens e desvantagens dessa escolha. Os valores de referência foram obtidos na região us-east-1 (N. Virgínia), consultados em agosto de 2026, e representam preços de lista (list price) — sem descontos por volume negociados, Savings Plans ou Reserved Capacity, que na prática reduziriam esses valores. Recomenda-se fortemente que o grupo confirme os valores atualizados no AWS Pricing Calculator antes da apresentação, pois os preços de nuvem mudam com frequência.</w:t>
+        <w:t>Nesta seção, estima-se um cenário analítico de 3,5 PB decimais na região us-east-1, com preços de lista consultados em 05/09/2026. Não é cotação. Workload-base: data lake em S3, objetos colunares/particionados, crescimento e frequência de leitura a serem confirmados pelo grupo; descontos negociados, suporte e impostos ficam fora até cotação.</w:t>
       </w:r>
     </w:p>
     <w:p>
@@ -2325,22 +2210,7 @@
         <w:jc w:val="both"/>
       </w:pPr>
       <w:r>
-        <w:rPr>
-          <w:rFonts w:ascii="Calibri" w:cs="Calibri" w:eastAsia="Calibri" w:hAnsi="Calibri"/>
-          <w:b/>
-          <w:bCs/>
-          <w:sz w:val="22"/>
-          <w:szCs w:val="22"/>
-        </w:rPr>
-        <w:t xml:space="preserve">Premissa de conversão: </w:t>
-      </w:r>
-      <w:r>
-        <w:rPr>
-          <w:rFonts w:ascii="Calibri" w:cs="Calibri" w:eastAsia="Calibri" w:hAnsi="Calibri"/>
-          <w:sz w:val="22"/>
-          <w:szCs w:val="22"/>
-        </w:rPr>
-        <w:t xml:space="preserve">adotando o padrão binário usual em sistemas de armazenamento (1 PB = 1.024 TB = 1.048.576 GB), 3,5 PB equivalem a aproximadamente 3.584 TB, ou 3.670.016 GB.</w:t>
+        <w:t>Premissa de conversão: PB é unidade decimal. Logo, 3,5 PB = 3.500 TB = 3.500.000 GB para cobrança em GB. Se a intenção fosse 3,5 PiB, seriam 3.670.016 GiB ou aproximadamente 3.940.649,674 GB; as bases não podem ser misturadas.</w:t>
       </w:r>
     </w:p>
     <w:p>
@@ -2358,12 +2228,7 @@
         <w:jc w:val="both"/>
       </w:pPr>
       <w:r>
-        <w:rPr>
-          <w:rFonts w:ascii="Calibri" w:cs="Calibri" w:eastAsia="Calibri" w:hAnsi="Calibri"/>
-          <w:sz w:val="22"/>
-          <w:szCs w:val="22"/>
-        </w:rPr>
-        <w:t xml:space="preserve">O Amazon S3 Standard utiliza um modelo de preço escalonado (tiered): US$ 0,023/GB nos primeiros 50 TB mensais, US$ 0,022/GB nos 450 TB seguintes e US$ 0,021/GB acima de 500 TB por mês. Aplicando essa tabela aos 3.584 TB do estudo, obtém-se a estimativa apresentada na Tabela 2.</w:t>
+        <w:t>O Amazon S3 Standard usa faixas em us-east-1: US$0,023/GB nos primeiros 50 TB, US$0,022/GB nos 450 TB seguintes e US$0,021/GB acima de 500 TB. Para 3.500.000 GB: 50.000×0,023 + 450.000×0,022 + 3.000.000×0,021 = US$74.050/mês, armazenamento apenas.</w:t>
       </w:r>
     </w:p>
     <w:tbl>
@@ -2401,19 +2266,8 @@
             <w:vAlign w:val="center"/>
           </w:tcPr>
           <w:p>
-            <w:pPr>
-              <w:jc w:val="left"/>
-            </w:pPr>
-            <w:r>
-              <w:rPr>
-                <w:rFonts w:ascii="Calibri" w:cs="Calibri" w:eastAsia="Calibri" w:hAnsi="Calibri"/>
-                <w:b/>
-                <w:bCs/>
-                <w:color w:val="FFFFFF"/>
-                <w:sz w:val="20"/>
-                <w:szCs w:val="20"/>
-              </w:rPr>
-              <w:t xml:space="preserve">Faixa</w:t>
+            <w:r>
+              <w:t>Faixa</w:t>
             </w:r>
           </w:p>
         </w:tc>
@@ -2430,19 +2284,8 @@
             <w:vAlign w:val="center"/>
           </w:tcPr>
           <w:p>
-            <w:pPr>
-              <w:jc w:val="left"/>
-            </w:pPr>
-            <w:r>
-              <w:rPr>
-                <w:rFonts w:ascii="Calibri" w:cs="Calibri" w:eastAsia="Calibri" w:hAnsi="Calibri"/>
-                <w:b/>
-                <w:bCs/>
-                <w:color w:val="FFFFFF"/>
-                <w:sz w:val="20"/>
-                <w:szCs w:val="20"/>
-              </w:rPr>
-              <w:t xml:space="preserve">Volume (TB)</w:t>
+            <w:r>
+              <w:t>Volume (TB)</w:t>
             </w:r>
           </w:p>
         </w:tc>
@@ -2459,19 +2302,8 @@
             <w:vAlign w:val="center"/>
           </w:tcPr>
           <w:p>
-            <w:pPr>
-              <w:jc w:val="left"/>
-            </w:pPr>
-            <w:r>
-              <w:rPr>
-                <w:rFonts w:ascii="Calibri" w:cs="Calibri" w:eastAsia="Calibri" w:hAnsi="Calibri"/>
-                <w:b/>
-                <w:bCs/>
-                <w:color w:val="FFFFFF"/>
-                <w:sz w:val="20"/>
-                <w:szCs w:val="20"/>
-              </w:rPr>
-              <w:t xml:space="preserve">Preço/GB (US$)</w:t>
+            <w:r>
+              <w:t>Preço/GB (US$)</w:t>
             </w:r>
           </w:p>
         </w:tc>
@@ -2488,19 +2320,8 @@
             <w:vAlign w:val="center"/>
           </w:tcPr>
           <w:p>
-            <w:pPr>
-              <w:jc w:val="left"/>
-            </w:pPr>
-            <w:r>
-              <w:rPr>
-                <w:rFonts w:ascii="Calibri" w:cs="Calibri" w:eastAsia="Calibri" w:hAnsi="Calibri"/>
-                <w:b/>
-                <w:bCs/>
-                <w:color w:val="FFFFFF"/>
-                <w:sz w:val="20"/>
-                <w:szCs w:val="20"/>
-              </w:rPr>
-              <w:t xml:space="preserve">Custo mensal (US$)</w:t>
+            <w:r>
+              <w:t>Custo mensal (US$)</w:t>
             </w:r>
           </w:p>
         </w:tc>
@@ -2519,19 +2340,8 @@
             <w:vAlign w:val="center"/>
           </w:tcPr>
           <w:p>
-            <w:pPr>
-              <w:jc w:val="left"/>
-            </w:pPr>
-            <w:r>
-              <w:rPr>
-                <w:rFonts w:ascii="Calibri" w:cs="Calibri" w:eastAsia="Calibri" w:hAnsi="Calibri"/>
-                <w:b w:val="false"/>
-                <w:bCs w:val="false"/>
-                <w:color w:val="000000"/>
-                <w:sz w:val="20"/>
-                <w:szCs w:val="20"/>
-              </w:rPr>
-              <w:t xml:space="preserve">Primeiros 50 TB</w:t>
+            <w:r>
+              <w:t>Primeiros 50 TB</w:t>
             </w:r>
           </w:p>
         </w:tc>
@@ -2548,19 +2358,8 @@
             <w:vAlign w:val="center"/>
           </w:tcPr>
           <w:p>
-            <w:pPr>
-              <w:jc w:val="left"/>
-            </w:pPr>
-            <w:r>
-              <w:rPr>
-                <w:rFonts w:ascii="Calibri" w:cs="Calibri" w:eastAsia="Calibri" w:hAnsi="Calibri"/>
-                <w:b w:val="false"/>
-                <w:bCs w:val="false"/>
-                <w:color w:val="000000"/>
-                <w:sz w:val="20"/>
-                <w:szCs w:val="20"/>
-              </w:rPr>
-              <w:t xml:space="preserve">50</w:t>
+            <w:r>
+              <w:t>50</w:t>
             </w:r>
           </w:p>
         </w:tc>
@@ -2577,19 +2376,8 @@
             <w:vAlign w:val="center"/>
           </w:tcPr>
           <w:p>
-            <w:pPr>
-              <w:jc w:val="left"/>
-            </w:pPr>
-            <w:r>
-              <w:rPr>
-                <w:rFonts w:ascii="Calibri" w:cs="Calibri" w:eastAsia="Calibri" w:hAnsi="Calibri"/>
-                <w:b w:val="false"/>
-                <w:bCs w:val="false"/>
-                <w:color w:val="000000"/>
-                <w:sz w:val="20"/>
-                <w:szCs w:val="20"/>
-              </w:rPr>
-              <w:t xml:space="preserve">0,023</w:t>
+            <w:r>
+              <w:t>0,023</w:t>
             </w:r>
           </w:p>
         </w:tc>
@@ -2606,19 +2394,8 @@
             <w:vAlign w:val="center"/>
           </w:tcPr>
           <w:p>
-            <w:pPr>
-              <w:jc w:val="left"/>
-            </w:pPr>
-            <w:r>
-              <w:rPr>
-                <w:rFonts w:ascii="Calibri" w:cs="Calibri" w:eastAsia="Calibri" w:hAnsi="Calibri"/>
-                <w:b w:val="false"/>
-                <w:bCs w:val="false"/>
-                <w:color w:val="000000"/>
-                <w:sz w:val="20"/>
-                <w:szCs w:val="20"/>
-              </w:rPr>
-              <w:t xml:space="preserve">1.150</w:t>
+            <w:r>
+              <w:t>1.150</w:t>
             </w:r>
           </w:p>
         </w:tc>
@@ -2637,19 +2414,8 @@
             <w:vAlign w:val="center"/>
           </w:tcPr>
           <w:p>
-            <w:pPr>
-              <w:jc w:val="left"/>
-            </w:pPr>
-            <w:r>
-              <w:rPr>
-                <w:rFonts w:ascii="Calibri" w:cs="Calibri" w:eastAsia="Calibri" w:hAnsi="Calibri"/>
-                <w:b w:val="false"/>
-                <w:bCs w:val="false"/>
-                <w:color w:val="000000"/>
-                <w:sz w:val="20"/>
-                <w:szCs w:val="20"/>
-              </w:rPr>
-              <w:t xml:space="preserve">50 TB – 500 TB</w:t>
+            <w:r>
+              <w:t>50–500 TB</w:t>
             </w:r>
           </w:p>
         </w:tc>
@@ -2666,19 +2432,8 @@
             <w:vAlign w:val="center"/>
           </w:tcPr>
           <w:p>
-            <w:pPr>
-              <w:jc w:val="left"/>
-            </w:pPr>
-            <w:r>
-              <w:rPr>
-                <w:rFonts w:ascii="Calibri" w:cs="Calibri" w:eastAsia="Calibri" w:hAnsi="Calibri"/>
-                <w:b w:val="false"/>
-                <w:bCs w:val="false"/>
-                <w:color w:val="000000"/>
-                <w:sz w:val="20"/>
-                <w:szCs w:val="20"/>
-              </w:rPr>
-              <w:t xml:space="preserve">450</w:t>
+            <w:r>
+              <w:t>450</w:t>
             </w:r>
           </w:p>
         </w:tc>
@@ -2695,19 +2450,8 @@
             <w:vAlign w:val="center"/>
           </w:tcPr>
           <w:p>
-            <w:pPr>
-              <w:jc w:val="left"/>
-            </w:pPr>
-            <w:r>
-              <w:rPr>
-                <w:rFonts w:ascii="Calibri" w:cs="Calibri" w:eastAsia="Calibri" w:hAnsi="Calibri"/>
-                <w:b w:val="false"/>
-                <w:bCs w:val="false"/>
-                <w:color w:val="000000"/>
-                <w:sz w:val="20"/>
-                <w:szCs w:val="20"/>
-              </w:rPr>
-              <w:t xml:space="preserve">0,022</w:t>
+            <w:r>
+              <w:t>0,022</w:t>
             </w:r>
           </w:p>
         </w:tc>
@@ -2724,19 +2468,8 @@
             <w:vAlign w:val="center"/>
           </w:tcPr>
           <w:p>
-            <w:pPr>
-              <w:jc w:val="left"/>
-            </w:pPr>
-            <w:r>
-              <w:rPr>
-                <w:rFonts w:ascii="Calibri" w:cs="Calibri" w:eastAsia="Calibri" w:hAnsi="Calibri"/>
-                <w:b w:val="false"/>
-                <w:bCs w:val="false"/>
-                <w:color w:val="000000"/>
-                <w:sz w:val="20"/>
-                <w:szCs w:val="20"/>
-              </w:rPr>
-              <w:t xml:space="preserve">9.900</w:t>
+            <w:r>
+              <w:t>9.900</w:t>
             </w:r>
           </w:p>
         </w:tc>
@@ -2755,19 +2488,8 @@
             <w:vAlign w:val="center"/>
           </w:tcPr>
           <w:p>
-            <w:pPr>
-              <w:jc w:val="left"/>
-            </w:pPr>
-            <w:r>
-              <w:rPr>
-                <w:rFonts w:ascii="Calibri" w:cs="Calibri" w:eastAsia="Calibri" w:hAnsi="Calibri"/>
-                <w:b w:val="false"/>
-                <w:bCs w:val="false"/>
-                <w:color w:val="000000"/>
-                <w:sz w:val="20"/>
-                <w:szCs w:val="20"/>
-              </w:rPr>
-              <w:t xml:space="preserve">Acima de 500 TB</w:t>
+            <w:r>
+              <w:t>Acima de 500 TB</w:t>
             </w:r>
           </w:p>
         </w:tc>
@@ -2784,19 +2506,8 @@
             <w:vAlign w:val="center"/>
           </w:tcPr>
           <w:p>
-            <w:pPr>
-              <w:jc w:val="left"/>
-            </w:pPr>
-            <w:r>
-              <w:rPr>
-                <w:rFonts w:ascii="Calibri" w:cs="Calibri" w:eastAsia="Calibri" w:hAnsi="Calibri"/>
-                <w:b w:val="false"/>
-                <w:bCs w:val="false"/>
-                <w:color w:val="000000"/>
-                <w:sz w:val="20"/>
-                <w:szCs w:val="20"/>
-              </w:rPr>
-              <w:t xml:space="preserve">3.084</w:t>
+            <w:r>
+              <w:t>3.000</w:t>
             </w:r>
           </w:p>
         </w:tc>
@@ -2813,19 +2524,8 @@
             <w:vAlign w:val="center"/>
           </w:tcPr>
           <w:p>
-            <w:pPr>
-              <w:jc w:val="left"/>
-            </w:pPr>
-            <w:r>
-              <w:rPr>
-                <w:rFonts w:ascii="Calibri" w:cs="Calibri" w:eastAsia="Calibri" w:hAnsi="Calibri"/>
-                <w:b w:val="false"/>
-                <w:bCs w:val="false"/>
-                <w:color w:val="000000"/>
-                <w:sz w:val="20"/>
-                <w:szCs w:val="20"/>
-              </w:rPr>
-              <w:t xml:space="preserve">0,021</w:t>
+            <w:r>
+              <w:t>0,021</w:t>
             </w:r>
           </w:p>
         </w:tc>
@@ -2842,19 +2542,8 @@
             <w:vAlign w:val="center"/>
           </w:tcPr>
           <w:p>
-            <w:pPr>
-              <w:jc w:val="left"/>
-            </w:pPr>
-            <w:r>
-              <w:rPr>
-                <w:rFonts w:ascii="Calibri" w:cs="Calibri" w:eastAsia="Calibri" w:hAnsi="Calibri"/>
-                <w:b w:val="false"/>
-                <w:bCs w:val="false"/>
-                <w:color w:val="000000"/>
-                <w:sz w:val="20"/>
-                <w:szCs w:val="20"/>
-              </w:rPr>
-              <w:t xml:space="preserve">64.764</w:t>
+            <w:r>
+              <w:t>63.000</w:t>
             </w:r>
           </w:p>
         </w:tc>
@@ -2873,19 +2562,8 @@
             <w:vAlign w:val="center"/>
           </w:tcPr>
           <w:p>
-            <w:pPr>
-              <w:jc w:val="left"/>
-            </w:pPr>
-            <w:r>
-              <w:rPr>
-                <w:rFonts w:ascii="Calibri" w:cs="Calibri" w:eastAsia="Calibri" w:hAnsi="Calibri"/>
-                <w:b w:val="false"/>
-                <w:bCs w:val="false"/>
-                <w:color w:val="000000"/>
-                <w:sz w:val="20"/>
-                <w:szCs w:val="20"/>
-              </w:rPr>
-              <w:t xml:space="preserve">Total (S3 Standard)</w:t>
+            <w:r>
+              <w:t>Total S3 Standard</w:t>
             </w:r>
           </w:p>
         </w:tc>
@@ -2902,19 +2580,8 @@
             <w:vAlign w:val="center"/>
           </w:tcPr>
           <w:p>
-            <w:pPr>
-              <w:jc w:val="left"/>
-            </w:pPr>
-            <w:r>
-              <w:rPr>
-                <w:rFonts w:ascii="Calibri" w:cs="Calibri" w:eastAsia="Calibri" w:hAnsi="Calibri"/>
-                <w:b w:val="false"/>
-                <w:bCs w:val="false"/>
-                <w:color w:val="000000"/>
-                <w:sz w:val="20"/>
-                <w:szCs w:val="20"/>
-              </w:rPr>
-              <w:t xml:space="preserve">3.584</w:t>
+            <w:r>
+              <w:t>3.500</w:t>
             </w:r>
           </w:p>
         </w:tc>
@@ -2931,19 +2598,8 @@
             <w:vAlign w:val="center"/>
           </w:tcPr>
           <w:p>
-            <w:pPr>
-              <w:jc w:val="left"/>
-            </w:pPr>
-            <w:r>
-              <w:rPr>
-                <w:rFonts w:ascii="Calibri" w:cs="Calibri" w:eastAsia="Calibri" w:hAnsi="Calibri"/>
-                <w:b w:val="false"/>
-                <w:bCs w:val="false"/>
-                <w:color w:val="000000"/>
-                <w:sz w:val="20"/>
-                <w:szCs w:val="20"/>
-              </w:rPr>
-              <w:t xml:space="preserve">—</w:t>
+            <w:r>
+              <w:t>—</w:t>
             </w:r>
           </w:p>
         </w:tc>
@@ -2960,19 +2616,8 @@
             <w:vAlign w:val="center"/>
           </w:tcPr>
           <w:p>
-            <w:pPr>
-              <w:jc w:val="left"/>
-            </w:pPr>
-            <w:r>
-              <w:rPr>
-                <w:rFonts w:ascii="Calibri" w:cs="Calibri" w:eastAsia="Calibri" w:hAnsi="Calibri"/>
-                <w:b w:val="false"/>
-                <w:bCs w:val="false"/>
-                <w:color w:val="000000"/>
-                <w:sz w:val="20"/>
-                <w:szCs w:val="20"/>
-              </w:rPr>
-              <w:t xml:space="preserve">≈ 75.814 / mês (≈ US$ 909.800 / ano)</w:t>
+            <w:r>
+              <w:t>74.050/mês; 888.600/ano</w:t>
             </w:r>
           </w:p>
         </w:tc>
@@ -3044,19 +2689,8 @@
             <w:vAlign w:val="center"/>
           </w:tcPr>
           <w:p>
-            <w:pPr>
-              <w:jc w:val="left"/>
-            </w:pPr>
-            <w:r>
-              <w:rPr>
-                <w:rFonts w:ascii="Calibri" w:cs="Calibri" w:eastAsia="Calibri" w:hAnsi="Calibri"/>
-                <w:b/>
-                <w:bCs/>
-                <w:color w:val="FFFFFF"/>
-                <w:sz w:val="20"/>
-                <w:szCs w:val="20"/>
-              </w:rPr>
-              <w:t xml:space="preserve">Classe de armazenamento</w:t>
+            <w:r>
+              <w:t>Classe</w:t>
             </w:r>
           </w:p>
         </w:tc>
@@ -3073,19 +2707,8 @@
             <w:vAlign w:val="center"/>
           </w:tcPr>
           <w:p>
-            <w:pPr>
-              <w:jc w:val="left"/>
-            </w:pPr>
-            <w:r>
-              <w:rPr>
-                <w:rFonts w:ascii="Calibri" w:cs="Calibri" w:eastAsia="Calibri" w:hAnsi="Calibri"/>
-                <w:b/>
-                <w:bCs/>
-                <w:color w:val="FFFFFF"/>
-                <w:sz w:val="20"/>
-                <w:szCs w:val="20"/>
-              </w:rPr>
-              <w:t xml:space="preserve">Preço aprox. (US$/GB/mês)</w:t>
+            <w:r>
+              <w:t>US$/GB-mês</w:t>
             </w:r>
           </w:p>
         </w:tc>
@@ -3102,19 +2725,8 @@
             <w:vAlign w:val="center"/>
           </w:tcPr>
           <w:p>
-            <w:pPr>
-              <w:jc w:val="left"/>
-            </w:pPr>
-            <w:r>
-              <w:rPr>
-                <w:rFonts w:ascii="Calibri" w:cs="Calibri" w:eastAsia="Calibri" w:hAnsi="Calibri"/>
-                <w:b/>
-                <w:bCs/>
-                <w:color w:val="FFFFFF"/>
-                <w:sz w:val="20"/>
-                <w:szCs w:val="20"/>
-              </w:rPr>
-              <w:t xml:space="preserve">Custo mensal estimado (US$)</w:t>
+            <w:r>
+              <w:t>Armazenamento mensal</w:t>
             </w:r>
           </w:p>
         </w:tc>
@@ -3131,19 +2743,8 @@
             <w:vAlign w:val="center"/>
           </w:tcPr>
           <w:p>
-            <w:pPr>
-              <w:jc w:val="left"/>
-            </w:pPr>
-            <w:r>
-              <w:rPr>
-                <w:rFonts w:ascii="Calibri" w:cs="Calibri" w:eastAsia="Calibri" w:hAnsi="Calibri"/>
-                <w:b/>
-                <w:bCs/>
-                <w:color w:val="FFFFFF"/>
-                <w:sz w:val="20"/>
-                <w:szCs w:val="20"/>
-              </w:rPr>
-              <w:t xml:space="preserve">Latência de acesso</w:t>
+            <w:r>
+              <w:t>Condição principal</w:t>
             </w:r>
           </w:p>
         </w:tc>
@@ -3162,19 +2763,8 @@
             <w:vAlign w:val="center"/>
           </w:tcPr>
           <w:p>
-            <w:pPr>
-              <w:jc w:val="left"/>
-            </w:pPr>
-            <w:r>
-              <w:rPr>
-                <w:rFonts w:ascii="Calibri" w:cs="Calibri" w:eastAsia="Calibri" w:hAnsi="Calibri"/>
-                <w:b w:val="false"/>
-                <w:bCs w:val="false"/>
-                <w:color w:val="000000"/>
-                <w:sz w:val="20"/>
-                <w:szCs w:val="20"/>
-              </w:rPr>
-              <w:t xml:space="preserve">S3 Standard</w:t>
+            <w:r>
+              <w:t>S3 Standard</w:t>
             </w:r>
           </w:p>
         </w:tc>
@@ -3191,19 +2781,8 @@
             <w:vAlign w:val="center"/>
           </w:tcPr>
           <w:p>
-            <w:pPr>
-              <w:jc w:val="left"/>
-            </w:pPr>
-            <w:r>
-              <w:rPr>
-                <w:rFonts w:ascii="Calibri" w:cs="Calibri" w:eastAsia="Calibri" w:hAnsi="Calibri"/>
-                <w:b w:val="false"/>
-                <w:bCs w:val="false"/>
-                <w:color w:val="000000"/>
-                <w:sz w:val="20"/>
-                <w:szCs w:val="20"/>
-              </w:rPr>
-              <w:t xml:space="preserve">0,021 – 0,023 (escalonado)</w:t>
+            <w:r>
+              <w:t>faixas 0,023/0,022/0,021</w:t>
             </w:r>
           </w:p>
         </w:tc>
@@ -3220,19 +2799,8 @@
             <w:vAlign w:val="center"/>
           </w:tcPr>
           <w:p>
-            <w:pPr>
-              <w:jc w:val="left"/>
-            </w:pPr>
-            <w:r>
-              <w:rPr>
-                <w:rFonts w:ascii="Calibri" w:cs="Calibri" w:eastAsia="Calibri" w:hAnsi="Calibri"/>
-                <w:b w:val="false"/>
-                <w:bCs w:val="false"/>
-                <w:color w:val="000000"/>
-                <w:sz w:val="20"/>
-                <w:szCs w:val="20"/>
-              </w:rPr>
-              <w:t xml:space="preserve">≈ 75.800</w:t>
+            <w:r>
+              <w:t>US$74.050</w:t>
             </w:r>
           </w:p>
         </w:tc>
@@ -3249,19 +2817,8 @@
             <w:vAlign w:val="center"/>
           </w:tcPr>
           <w:p>
-            <w:pPr>
-              <w:jc w:val="left"/>
-            </w:pPr>
-            <w:r>
-              <w:rPr>
-                <w:rFonts w:ascii="Calibri" w:cs="Calibri" w:eastAsia="Calibri" w:hAnsi="Calibri"/>
-                <w:b w:val="false"/>
-                <w:bCs w:val="false"/>
-                <w:color w:val="000000"/>
-                <w:sz w:val="20"/>
-                <w:szCs w:val="20"/>
-              </w:rPr>
-              <w:t xml:space="preserve">Milissegundos</w:t>
+            <w:r>
+              <w:t>Acesso frequente; requests à parte</w:t>
             </w:r>
           </w:p>
         </w:tc>
@@ -3280,19 +2837,8 @@
             <w:vAlign w:val="center"/>
           </w:tcPr>
           <w:p>
-            <w:pPr>
-              <w:jc w:val="left"/>
-            </w:pPr>
-            <w:r>
-              <w:rPr>
-                <w:rFonts w:ascii="Calibri" w:cs="Calibri" w:eastAsia="Calibri" w:hAnsi="Calibri"/>
-                <w:b w:val="false"/>
-                <w:bCs w:val="false"/>
-                <w:color w:val="000000"/>
-                <w:sz w:val="20"/>
-                <w:szCs w:val="20"/>
-              </w:rPr>
-              <w:t xml:space="preserve">S3 Standard-IA</w:t>
+            <w:r>
+              <w:t>Standard-IA</w:t>
             </w:r>
           </w:p>
         </w:tc>
@@ -3309,19 +2855,8 @@
             <w:vAlign w:val="center"/>
           </w:tcPr>
           <w:p>
-            <w:pPr>
-              <w:jc w:val="left"/>
-            </w:pPr>
-            <w:r>
-              <w:rPr>
-                <w:rFonts w:ascii="Calibri" w:cs="Calibri" w:eastAsia="Calibri" w:hAnsi="Calibri"/>
-                <w:b w:val="false"/>
-                <w:bCs w:val="false"/>
-                <w:color w:val="000000"/>
-                <w:sz w:val="20"/>
-                <w:szCs w:val="20"/>
-              </w:rPr>
-              <w:t xml:space="preserve">0,0125</w:t>
+            <w:r>
+              <w:t>0,0125</w:t>
             </w:r>
           </w:p>
         </w:tc>
@@ -3338,19 +2873,8 @@
             <w:vAlign w:val="center"/>
           </w:tcPr>
           <w:p>
-            <w:pPr>
-              <w:jc w:val="left"/>
-            </w:pPr>
-            <w:r>
-              <w:rPr>
-                <w:rFonts w:ascii="Calibri" w:cs="Calibri" w:eastAsia="Calibri" w:hAnsi="Calibri"/>
-                <w:b w:val="false"/>
-                <w:bCs w:val="false"/>
-                <w:color w:val="000000"/>
-                <w:sz w:val="20"/>
-                <w:szCs w:val="20"/>
-              </w:rPr>
-              <w:t xml:space="preserve">≈ 45.875</w:t>
+            <w:r>
+              <w:t>US$43.750</w:t>
             </w:r>
           </w:p>
         </w:tc>
@@ -3367,19 +2891,8 @@
             <w:vAlign w:val="center"/>
           </w:tcPr>
           <w:p>
-            <w:pPr>
-              <w:jc w:val="left"/>
-            </w:pPr>
-            <w:r>
-              <w:rPr>
-                <w:rFonts w:ascii="Calibri" w:cs="Calibri" w:eastAsia="Calibri" w:hAnsi="Calibri"/>
-                <w:b w:val="false"/>
-                <w:bCs w:val="false"/>
-                <w:color w:val="000000"/>
-                <w:sz w:val="20"/>
-                <w:szCs w:val="20"/>
-              </w:rPr>
-              <w:t xml:space="preserve">Milissegundos (com taxa de recuperação)</w:t>
+            <w:r>
+              <w:t>Retrieval, 128 KB mínimo, 30 dias</w:t>
             </w:r>
           </w:p>
         </w:tc>
@@ -3398,19 +2911,8 @@
             <w:vAlign w:val="center"/>
           </w:tcPr>
           <w:p>
-            <w:pPr>
-              <w:jc w:val="left"/>
-            </w:pPr>
-            <w:r>
-              <w:rPr>
-                <w:rFonts w:ascii="Calibri" w:cs="Calibri" w:eastAsia="Calibri" w:hAnsi="Calibri"/>
-                <w:b w:val="false"/>
-                <w:bCs w:val="false"/>
-                <w:color w:val="000000"/>
-                <w:sz w:val="20"/>
-                <w:szCs w:val="20"/>
-              </w:rPr>
-              <w:t xml:space="preserve">S3 Glacier Flexible Retrieval</w:t>
+            <w:r>
+              <w:t>Glacier Flexible</w:t>
             </w:r>
           </w:p>
         </w:tc>
@@ -3427,19 +2929,8 @@
             <w:vAlign w:val="center"/>
           </w:tcPr>
           <w:p>
-            <w:pPr>
-              <w:jc w:val="left"/>
-            </w:pPr>
-            <w:r>
-              <w:rPr>
-                <w:rFonts w:ascii="Calibri" w:cs="Calibri" w:eastAsia="Calibri" w:hAnsi="Calibri"/>
-                <w:b w:val="false"/>
-                <w:bCs w:val="false"/>
-                <w:color w:val="000000"/>
-                <w:sz w:val="20"/>
-                <w:szCs w:val="20"/>
-              </w:rPr>
-              <w:t xml:space="preserve">≈ 0,0036</w:t>
+            <w:r>
+              <w:t>0,0036</w:t>
             </w:r>
           </w:p>
         </w:tc>
@@ -3456,19 +2947,8 @@
             <w:vAlign w:val="center"/>
           </w:tcPr>
           <w:p>
-            <w:pPr>
-              <w:jc w:val="left"/>
-            </w:pPr>
-            <w:r>
-              <w:rPr>
-                <w:rFonts w:ascii="Calibri" w:cs="Calibri" w:eastAsia="Calibri" w:hAnsi="Calibri"/>
-                <w:b w:val="false"/>
-                <w:bCs w:val="false"/>
-                <w:color w:val="000000"/>
-                <w:sz w:val="20"/>
-                <w:szCs w:val="20"/>
-              </w:rPr>
-              <w:t xml:space="preserve">≈ 13.212</w:t>
+            <w:r>
+              <w:t>US$12.600</w:t>
             </w:r>
           </w:p>
         </w:tc>
@@ -3485,19 +2965,8 @@
             <w:vAlign w:val="center"/>
           </w:tcPr>
           <w:p>
-            <w:pPr>
-              <w:jc w:val="left"/>
-            </w:pPr>
-            <w:r>
-              <w:rPr>
-                <w:rFonts w:ascii="Calibri" w:cs="Calibri" w:eastAsia="Calibri" w:hAnsi="Calibri"/>
-                <w:b w:val="false"/>
-                <w:bCs w:val="false"/>
-                <w:color w:val="000000"/>
-                <w:sz w:val="20"/>
-                <w:szCs w:val="20"/>
-              </w:rPr>
-              <w:t xml:space="preserve">Minutos a horas</w:t>
+            <w:r>
+              <w:t>Retrieval/metadados; 90 dias</w:t>
             </w:r>
           </w:p>
         </w:tc>
@@ -3516,19 +2985,8 @@
             <w:vAlign w:val="center"/>
           </w:tcPr>
           <w:p>
-            <w:pPr>
-              <w:jc w:val="left"/>
-            </w:pPr>
-            <w:r>
-              <w:rPr>
-                <w:rFonts w:ascii="Calibri" w:cs="Calibri" w:eastAsia="Calibri" w:hAnsi="Calibri"/>
-                <w:b w:val="false"/>
-                <w:bCs w:val="false"/>
-                <w:color w:val="000000"/>
-                <w:sz w:val="20"/>
-                <w:szCs w:val="20"/>
-              </w:rPr>
-              <w:t xml:space="preserve">S3 Glacier Deep Archive</w:t>
+            <w:r>
+              <w:t>Glacier Deep Archive</w:t>
             </w:r>
           </w:p>
         </w:tc>
@@ -3545,19 +3003,8 @@
             <w:vAlign w:val="center"/>
           </w:tcPr>
           <w:p>
-            <w:pPr>
-              <w:jc w:val="left"/>
-            </w:pPr>
-            <w:r>
-              <w:rPr>
-                <w:rFonts w:ascii="Calibri" w:cs="Calibri" w:eastAsia="Calibri" w:hAnsi="Calibri"/>
-                <w:b w:val="false"/>
-                <w:bCs w:val="false"/>
-                <w:color w:val="000000"/>
-                <w:sz w:val="20"/>
-                <w:szCs w:val="20"/>
-              </w:rPr>
-              <w:t xml:space="preserve">0,00099</w:t>
+            <w:r>
+              <w:t>0,00099</w:t>
             </w:r>
           </w:p>
         </w:tc>
@@ -3574,19 +3021,8 @@
             <w:vAlign w:val="center"/>
           </w:tcPr>
           <w:p>
-            <w:pPr>
-              <w:jc w:val="left"/>
-            </w:pPr>
-            <w:r>
-              <w:rPr>
-                <w:rFonts w:ascii="Calibri" w:cs="Calibri" w:eastAsia="Calibri" w:hAnsi="Calibri"/>
-                <w:b w:val="false"/>
-                <w:bCs w:val="false"/>
-                <w:color w:val="000000"/>
-                <w:sz w:val="20"/>
-                <w:szCs w:val="20"/>
-              </w:rPr>
-              <w:t xml:space="preserve">≈ 3.633 (≈ US$ 43.600/ano)</w:t>
+            <w:r>
+              <w:t>US$3.465</w:t>
             </w:r>
           </w:p>
         </w:tc>
@@ -3603,19 +3039,8 @@
             <w:vAlign w:val="center"/>
           </w:tcPr>
           <w:p>
-            <w:pPr>
-              <w:jc w:val="left"/>
-            </w:pPr>
-            <w:r>
-              <w:rPr>
-                <w:rFonts w:ascii="Calibri" w:cs="Calibri" w:eastAsia="Calibri" w:hAnsi="Calibri"/>
-                <w:b w:val="false"/>
-                <w:bCs w:val="false"/>
-                <w:color w:val="000000"/>
-                <w:sz w:val="20"/>
-                <w:szCs w:val="20"/>
-              </w:rPr>
-              <w:t xml:space="preserve">12 a 48 horas</w:t>
+            <w:r>
+              <w:t>12–48 h; retrieval/metadados; 180 dias</w:t>
             </w:r>
           </w:p>
         </w:tc>
@@ -3667,12 +3092,7 @@
         <w:jc w:val="both"/>
       </w:pPr>
       <w:r>
-        <w:rPr>
-          <w:rFonts w:ascii="Calibri" w:cs="Calibri" w:eastAsia="Calibri" w:hAnsi="Calibri"/>
-          <w:sz w:val="22"/>
-          <w:szCs w:val="22"/>
-        </w:rPr>
-        <w:t xml:space="preserve">O custo de armazenamento é apenas uma das dimensões da fatura. Requisições (PUT/GET/LIST) são cobradas por milhar (cerca de US$ 0,005 por 1.000 requisições de escrita e US$ 0,0004 por 1.000 requisições de leitura), o que pode representar valores relevantes em cargas de altíssimo volume de acesso. A transferência de dados para fora da AWS (egress) é tipicamente a maior fonte de "surpresas" na fatura, com preços que partem de aproximadamente US$ 0,09/GB para os primeiros 10 TB mensais, reduzindo-se em faixas seguintes — transferir a totalidade de uma base de 3,5 PB para fora da nuvem uma única vez custaria, portanto, centenas de milhares de dólares, o que reforça a importância de processar os dados dentro da própria nuvem (evitando egress) sempre que possível.</w:t>
+        <w:t>Armazenamento é apenas uma parcela. O TCO deve incluir PUT/GET/LIST, transições, recuperação, mínimo de 128 KB em Standard-IA, metadados de arquivo, permanência mínima, KMS, catálogo, observabilidade, replicação, suporte e transferência. Egress depende de volume/destino/faixa e, em volumes altos, pode exigir cotação; não se apresenta total sem essas premissas.</w:t>
       </w:r>
     </w:p>
     <w:p>
@@ -3681,12 +3101,7 @@
         <w:jc w:val="both"/>
       </w:pPr>
       <w:r>
-        <w:rPr>
-          <w:rFonts w:ascii="Calibri" w:cs="Calibri" w:eastAsia="Calibri" w:hAnsi="Calibri"/>
-          <w:sz w:val="22"/>
-          <w:szCs w:val="22"/>
-        </w:rPr>
-        <w:t xml:space="preserve">Para processar uma base dessa escala, a AWS oferece, entre outras opções: clusters Amazon EMR (Hadoop/Spark) para processamento distribuído em lote; Amazon Redshift (ou Redshift Spectrum, que consulta dados diretamente no S3) para cargas analíticas recorrentes; e Amazon Athena para consultas SQL ad hoc sobre dados no S3, cobradas por volume de dados escaneado (aproximadamente US$ 5 por TB escaneado), o que também reforça a importância de formatos de armazenamento colunares e particionados (Parquet, ORC) para reduzir custo de consulta em bases desse porte.</w:t>
+        <w:t>Para analytics, um desenho plausível é S3 em Parquet/ORC com partições, Glue Catalog e Athena/EMR/Redshift Spectrum. A US$5/TB escaneado, uma varredura integral de 3.500 TB custa US$17.500; uma por dia por 30 dias, US$525.000/mês; ler 10% após compressão/poda custa US$1.750 por execução. Somar requests e resultados.</w:t>
       </w:r>
     </w:p>
     <w:p>
@@ -3893,12 +3308,7 @@
         <w:jc w:val="both"/>
       </w:pPr>
       <w:r>
-        <w:rPr>
-          <w:rFonts w:ascii="Calibri" w:cs="Calibri" w:eastAsia="Calibri" w:hAnsi="Calibri"/>
-          <w:sz w:val="22"/>
-          <w:szCs w:val="22"/>
-        </w:rPr>
-        <w:t xml:space="preserve">Em síntese, a AWS é tecnicamente capaz de armazenar e processar uma base de 3,5 PB, mas o custo mensal recorrente — estimado entre aproximadamente US$ 45 mil e US$ 76 mil por mês apenas para armazenamento (a depender da classe escolhida), sem contar processamento, requisições e eventual egress — torna essencial um desenho cuidadoso de arquitetura (camadas de armazenamento, formatos colunares, particionamento) e uma análise de custo total de propriedade (TCO) comparando essa opção com alternativas on-premises ou de nuvem híbrida, especialmente em cenários de uso de longuíssimo prazo.</w:t>
+        <w:t>Em síntese, a AWS comporta 3,5 PB em S3, mas não se deve presumir um único Aurora, RDS ou volume EBS: limites por cluster/volume/instância exigem validação por versão/região. Armazenamento puro varia de US$74.050/mês em Standard a US$3.465/mês em Deep Archive sob as tarifas assumidas, porém o TCO depende do padrão de acesso, processamento, recuperação, egress, crescimento, RPO/RTO e governança.</w:t>
       </w:r>
     </w:p>
     <w:p>
@@ -5710,19 +5120,8 @@
             <w:vAlign w:val="center"/>
           </w:tcPr>
           <w:p>
-            <w:pPr>
-              <w:jc w:val="left"/>
-            </w:pPr>
-            <w:r>
-              <w:rPr>
-                <w:rFonts w:ascii="Calibri" w:cs="Calibri" w:eastAsia="Calibri" w:hAnsi="Calibri"/>
-                <w:b w:val="false"/>
-                <w:bCs w:val="false"/>
-                <w:color w:val="000000"/>
-                <w:sz w:val="20"/>
-                <w:szCs w:val="20"/>
-              </w:rPr>
-              <w:t xml:space="preserve">[Nome 1]</w:t>
+            <w:r>
+              <w:t>[Nome 1]</w:t>
             </w:r>
           </w:p>
         </w:tc>
@@ -5739,19 +5138,8 @@
             <w:vAlign w:val="center"/>
           </w:tcPr>
           <w:p>
-            <w:pPr>
-              <w:jc w:val="left"/>
-            </w:pPr>
-            <w:r>
-              <w:rPr>
-                <w:rFonts w:ascii="Calibri" w:cs="Calibri" w:eastAsia="Calibri" w:hAnsi="Calibri"/>
-                <w:b w:val="false"/>
-                <w:bCs w:val="false"/>
-                <w:color w:val="000000"/>
-                <w:sz w:val="20"/>
-                <w:szCs w:val="20"/>
-              </w:rPr>
-              <w:t xml:space="preserve">[ ] Sim</w:t>
+            <w:r>
+              <w:t>[ ] Sim</w:t>
             </w:r>
           </w:p>
         </w:tc>
@@ -5768,19 +5156,8 @@
             <w:vAlign w:val="center"/>
           </w:tcPr>
           <w:p>
-            <w:pPr>
-              <w:jc w:val="left"/>
-            </w:pPr>
-            <w:r>
-              <w:rPr>
-                <w:rFonts w:ascii="Calibri" w:cs="Calibri" w:eastAsia="Calibri" w:hAnsi="Calibri"/>
-                <w:b w:val="false"/>
-                <w:bCs w:val="false"/>
-                <w:color w:val="000000"/>
-                <w:sz w:val="20"/>
-                <w:szCs w:val="20"/>
-              </w:rPr>
-              <w:t xml:space="preserve">[__/__/2026]</w:t>
+            <w:r>
+              <w:t>[__/__/2026]</w:t>
             </w:r>
           </w:p>
         </w:tc>
@@ -5797,19 +5174,8 @@
             <w:vAlign w:val="center"/>
           </w:tcPr>
           <w:p>
-            <w:pPr>
-              <w:jc w:val="left"/>
-            </w:pPr>
-            <w:r>
-              <w:rPr>
-                <w:rFonts w:ascii="Calibri" w:cs="Calibri" w:eastAsia="Calibri" w:hAnsi="Calibri"/>
-                <w:b w:val="false"/>
-                <w:bCs w:val="false"/>
-                <w:color w:val="000000"/>
-                <w:sz w:val="20"/>
-                <w:szCs w:val="20"/>
-              </w:rPr>
-              <w:t xml:space="preserve">________________</w:t>
+            <w:r>
+              <w:t>________________</w:t>
             </w:r>
           </w:p>
         </w:tc>
@@ -5828,19 +5194,8 @@
             <w:vAlign w:val="center"/>
           </w:tcPr>
           <w:p>
-            <w:pPr>
-              <w:jc w:val="left"/>
-            </w:pPr>
-            <w:r>
-              <w:rPr>
-                <w:rFonts w:ascii="Calibri" w:cs="Calibri" w:eastAsia="Calibri" w:hAnsi="Calibri"/>
-                <w:b w:val="false"/>
-                <w:bCs w:val="false"/>
-                <w:color w:val="000000"/>
-                <w:sz w:val="20"/>
-                <w:szCs w:val="20"/>
-              </w:rPr>
-              <w:t xml:space="preserve">[Nome 2]</w:t>
+            <w:r>
+              <w:t>[Nome 2]</w:t>
             </w:r>
           </w:p>
         </w:tc>
@@ -5857,19 +5212,8 @@
             <w:vAlign w:val="center"/>
           </w:tcPr>
           <w:p>
-            <w:pPr>
-              <w:jc w:val="left"/>
-            </w:pPr>
-            <w:r>
-              <w:rPr>
-                <w:rFonts w:ascii="Calibri" w:cs="Calibri" w:eastAsia="Calibri" w:hAnsi="Calibri"/>
-                <w:b w:val="false"/>
-                <w:bCs w:val="false"/>
-                <w:color w:val="000000"/>
-                <w:sz w:val="20"/>
-                <w:szCs w:val="20"/>
-              </w:rPr>
-              <w:t xml:space="preserve">[ ] Sim</w:t>
+            <w:r>
+              <w:t>[ ] Sim</w:t>
             </w:r>
           </w:p>
         </w:tc>
@@ -5886,19 +5230,8 @@
             <w:vAlign w:val="center"/>
           </w:tcPr>
           <w:p>
-            <w:pPr>
-              <w:jc w:val="left"/>
-            </w:pPr>
-            <w:r>
-              <w:rPr>
-                <w:rFonts w:ascii="Calibri" w:cs="Calibri" w:eastAsia="Calibri" w:hAnsi="Calibri"/>
-                <w:b w:val="false"/>
-                <w:bCs w:val="false"/>
-                <w:color w:val="000000"/>
-                <w:sz w:val="20"/>
-                <w:szCs w:val="20"/>
-              </w:rPr>
-              <w:t xml:space="preserve">[__/__/2026]</w:t>
+            <w:r>
+              <w:t>[__/__/2026]</w:t>
             </w:r>
           </w:p>
         </w:tc>
@@ -5915,19 +5248,8 @@
             <w:vAlign w:val="center"/>
           </w:tcPr>
           <w:p>
-            <w:pPr>
-              <w:jc w:val="left"/>
-            </w:pPr>
-            <w:r>
-              <w:rPr>
-                <w:rFonts w:ascii="Calibri" w:cs="Calibri" w:eastAsia="Calibri" w:hAnsi="Calibri"/>
-                <w:b w:val="false"/>
-                <w:bCs w:val="false"/>
-                <w:color w:val="000000"/>
-                <w:sz w:val="20"/>
-                <w:szCs w:val="20"/>
-              </w:rPr>
-              <w:t xml:space="preserve">________________</w:t>
+            <w:r>
+              <w:t>________________</w:t>
             </w:r>
           </w:p>
         </w:tc>
@@ -5946,19 +5268,8 @@
             <w:vAlign w:val="center"/>
           </w:tcPr>
           <w:p>
-            <w:pPr>
-              <w:jc w:val="left"/>
-            </w:pPr>
-            <w:r>
-              <w:rPr>
-                <w:rFonts w:ascii="Calibri" w:cs="Calibri" w:eastAsia="Calibri" w:hAnsi="Calibri"/>
-                <w:b w:val="false"/>
-                <w:bCs w:val="false"/>
-                <w:color w:val="000000"/>
-                <w:sz w:val="20"/>
-                <w:szCs w:val="20"/>
-              </w:rPr>
-              <w:t xml:space="preserve">[Nome 3]</w:t>
+            <w:r>
+              <w:t>[Nome 3]</w:t>
             </w:r>
           </w:p>
         </w:tc>
@@ -5975,19 +5286,8 @@
             <w:vAlign w:val="center"/>
           </w:tcPr>
           <w:p>
-            <w:pPr>
-              <w:jc w:val="left"/>
-            </w:pPr>
-            <w:r>
-              <w:rPr>
-                <w:rFonts w:ascii="Calibri" w:cs="Calibri" w:eastAsia="Calibri" w:hAnsi="Calibri"/>
-                <w:b w:val="false"/>
-                <w:bCs w:val="false"/>
-                <w:color w:val="000000"/>
-                <w:sz w:val="20"/>
-                <w:szCs w:val="20"/>
-              </w:rPr>
-              <w:t xml:space="preserve">[ ] Sim</w:t>
+            <w:r>
+              <w:t>[ ] Sim</w:t>
             </w:r>
           </w:p>
         </w:tc>
@@ -6004,19 +5304,8 @@
             <w:vAlign w:val="center"/>
           </w:tcPr>
           <w:p>
-            <w:pPr>
-              <w:jc w:val="left"/>
-            </w:pPr>
-            <w:r>
-              <w:rPr>
-                <w:rFonts w:ascii="Calibri" w:cs="Calibri" w:eastAsia="Calibri" w:hAnsi="Calibri"/>
-                <w:b w:val="false"/>
-                <w:bCs w:val="false"/>
-                <w:color w:val="000000"/>
-                <w:sz w:val="20"/>
-                <w:szCs w:val="20"/>
-              </w:rPr>
-              <w:t xml:space="preserve">[__/__/2026]</w:t>
+            <w:r>
+              <w:t>[__/__/2026]</w:t>
             </w:r>
           </w:p>
         </w:tc>
@@ -6033,19 +5322,8 @@
             <w:vAlign w:val="center"/>
           </w:tcPr>
           <w:p>
-            <w:pPr>
-              <w:jc w:val="left"/>
-            </w:pPr>
-            <w:r>
-              <w:rPr>
-                <w:rFonts w:ascii="Calibri" w:cs="Calibri" w:eastAsia="Calibri" w:hAnsi="Calibri"/>
-                <w:b w:val="false"/>
-                <w:bCs w:val="false"/>
-                <w:color w:val="000000"/>
-                <w:sz w:val="20"/>
-                <w:szCs w:val="20"/>
-              </w:rPr>
-              <w:t xml:space="preserve">________________</w:t>
+            <w:r>
+              <w:t>________________</w:t>
             </w:r>
           </w:p>
         </w:tc>
@@ -6064,19 +5342,8 @@
             <w:vAlign w:val="center"/>
           </w:tcPr>
           <w:p>
-            <w:pPr>
-              <w:jc w:val="left"/>
-            </w:pPr>
-            <w:r>
-              <w:rPr>
-                <w:rFonts w:ascii="Calibri" w:cs="Calibri" w:eastAsia="Calibri" w:hAnsi="Calibri"/>
-                <w:b w:val="false"/>
-                <w:bCs w:val="false"/>
-                <w:color w:val="000000"/>
-                <w:sz w:val="20"/>
-                <w:szCs w:val="20"/>
-              </w:rPr>
-              <w:t xml:space="preserve">[Nome 4]</w:t>
+            <w:r>
+              <w:t>[Nome 4]</w:t>
             </w:r>
           </w:p>
         </w:tc>
@@ -6093,19 +5360,8 @@
             <w:vAlign w:val="center"/>
           </w:tcPr>
           <w:p>
-            <w:pPr>
-              <w:jc w:val="left"/>
-            </w:pPr>
-            <w:r>
-              <w:rPr>
-                <w:rFonts w:ascii="Calibri" w:cs="Calibri" w:eastAsia="Calibri" w:hAnsi="Calibri"/>
-                <w:b w:val="false"/>
-                <w:bCs w:val="false"/>
-                <w:color w:val="000000"/>
-                <w:sz w:val="20"/>
-                <w:szCs w:val="20"/>
-              </w:rPr>
-              <w:t xml:space="preserve">[ ] Sim</w:t>
+            <w:r>
+              <w:t>[ ] Sim</w:t>
             </w:r>
           </w:p>
         </w:tc>
@@ -6122,19 +5378,8 @@
             <w:vAlign w:val="center"/>
           </w:tcPr>
           <w:p>
-            <w:pPr>
-              <w:jc w:val="left"/>
-            </w:pPr>
-            <w:r>
-              <w:rPr>
-                <w:rFonts w:ascii="Calibri" w:cs="Calibri" w:eastAsia="Calibri" w:hAnsi="Calibri"/>
-                <w:b w:val="false"/>
-                <w:bCs w:val="false"/>
-                <w:color w:val="000000"/>
-                <w:sz w:val="20"/>
-                <w:szCs w:val="20"/>
-              </w:rPr>
-              <w:t xml:space="preserve">[__/__/2026]</w:t>
+            <w:r>
+              <w:t>[__/__/2026]</w:t>
             </w:r>
           </w:p>
         </w:tc>
@@ -6151,19 +5396,8 @@
             <w:vAlign w:val="center"/>
           </w:tcPr>
           <w:p>
-            <w:pPr>
-              <w:jc w:val="left"/>
-            </w:pPr>
-            <w:r>
-              <w:rPr>
-                <w:rFonts w:ascii="Calibri" w:cs="Calibri" w:eastAsia="Calibri" w:hAnsi="Calibri"/>
-                <w:b w:val="false"/>
-                <w:bCs w:val="false"/>
-                <w:color w:val="000000"/>
-                <w:sz w:val="20"/>
-                <w:szCs w:val="20"/>
-              </w:rPr>
-              <w:t xml:space="preserve">________________</w:t>
+            <w:r>
+              <w:t>________________</w:t>
             </w:r>
           </w:p>
         </w:tc>
@@ -6182,19 +5416,8 @@
             <w:vAlign w:val="center"/>
           </w:tcPr>
           <w:p>
-            <w:pPr>
-              <w:jc w:val="left"/>
-            </w:pPr>
-            <w:r>
-              <w:rPr>
-                <w:rFonts w:ascii="Calibri" w:cs="Calibri" w:eastAsia="Calibri" w:hAnsi="Calibri"/>
-                <w:b w:val="false"/>
-                <w:bCs w:val="false"/>
-                <w:color w:val="000000"/>
-                <w:sz w:val="20"/>
-                <w:szCs w:val="20"/>
-              </w:rPr>
-              <w:t xml:space="preserve">[Nome 5]</w:t>
+            <w:r>
+              <w:t>[Nome 5]</w:t>
             </w:r>
           </w:p>
         </w:tc>
@@ -6211,19 +5434,8 @@
             <w:vAlign w:val="center"/>
           </w:tcPr>
           <w:p>
-            <w:pPr>
-              <w:jc w:val="left"/>
-            </w:pPr>
-            <w:r>
-              <w:rPr>
-                <w:rFonts w:ascii="Calibri" w:cs="Calibri" w:eastAsia="Calibri" w:hAnsi="Calibri"/>
-                <w:b w:val="false"/>
-                <w:bCs w:val="false"/>
-                <w:color w:val="000000"/>
-                <w:sz w:val="20"/>
-                <w:szCs w:val="20"/>
-              </w:rPr>
-              <w:t xml:space="preserve">[ ] Sim</w:t>
+            <w:r>
+              <w:t>[ ] Sim</w:t>
             </w:r>
           </w:p>
         </w:tc>
@@ -6240,19 +5452,8 @@
             <w:vAlign w:val="center"/>
           </w:tcPr>
           <w:p>
-            <w:pPr>
-              <w:jc w:val="left"/>
-            </w:pPr>
-            <w:r>
-              <w:rPr>
-                <w:rFonts w:ascii="Calibri" w:cs="Calibri" w:eastAsia="Calibri" w:hAnsi="Calibri"/>
-                <w:b w:val="false"/>
-                <w:bCs w:val="false"/>
-                <w:color w:val="000000"/>
-                <w:sz w:val="20"/>
-                <w:szCs w:val="20"/>
-              </w:rPr>
-              <w:t xml:space="preserve">[__/__/2026]</w:t>
+            <w:r>
+              <w:t>[__/__/2026]</w:t>
             </w:r>
           </w:p>
         </w:tc>
@@ -6269,19 +5470,8 @@
             <w:vAlign w:val="center"/>
           </w:tcPr>
           <w:p>
-            <w:pPr>
-              <w:jc w:val="left"/>
-            </w:pPr>
-            <w:r>
-              <w:rPr>
-                <w:rFonts w:ascii="Calibri" w:cs="Calibri" w:eastAsia="Calibri" w:hAnsi="Calibri"/>
-                <w:b w:val="false"/>
-                <w:bCs w:val="false"/>
-                <w:color w:val="000000"/>
-                <w:sz w:val="20"/>
-                <w:szCs w:val="20"/>
-              </w:rPr>
-              <w:t xml:space="preserve">________________</w:t>
+            <w:r>
+              <w:t>________________</w:t>
             </w:r>
           </w:p>
         </w:tc>
@@ -6627,19 +5817,8 @@
             <w:vAlign w:val="center"/>
           </w:tcPr>
           <w:p>
-            <w:pPr>
-              <w:jc w:val="left"/>
-            </w:pPr>
-            <w:r>
-              <w:rPr>
-                <w:rFonts w:ascii="Calibri" w:cs="Calibri" w:eastAsia="Calibri" w:hAnsi="Calibri"/>
-                <w:b w:val="false"/>
-                <w:bCs w:val="false"/>
-                <w:color w:val="000000"/>
-                <w:sz w:val="20"/>
-                <w:szCs w:val="20"/>
-              </w:rPr>
-              <w:t xml:space="preserve">Ambiguidade na conversão de Petabytes para Gigabytes: IA pode alternar, sem aviso, entre padrão binário (1.024) e decimal (1.000), gerando inconsistência numérica entre seções.</w:t>
+            <w:r>
+              <w:t>PB decimal foi confundido com PiB/GiB e tabelas usaram bases diferentes.</w:t>
             </w:r>
           </w:p>
         </w:tc>
@@ -6656,19 +5835,8 @@
             <w:vAlign w:val="center"/>
           </w:tcPr>
           <w:p>
-            <w:pPr>
-              <w:jc w:val="left"/>
-            </w:pPr>
-            <w:r>
-              <w:rPr>
-                <w:rFonts w:ascii="Calibri" w:cs="Calibri" w:eastAsia="Calibri" w:hAnsi="Calibri"/>
-                <w:b w:val="false"/>
-                <w:bCs w:val="false"/>
-                <w:color w:val="000000"/>
-                <w:sz w:val="20"/>
-                <w:szCs w:val="20"/>
-              </w:rPr>
-              <w:t xml:space="preserve">Revisão manual da premissa de conversão apresentada na abertura da Seção 8.</w:t>
+            <w:r>
+              <w:t>Reprodução de cada multiplicação e conferência das unidades AWS.</w:t>
             </w:r>
           </w:p>
         </w:tc>
@@ -6685,19 +5853,8 @@
             <w:vAlign w:val="center"/>
           </w:tcPr>
           <w:p>
-            <w:pPr>
-              <w:jc w:val="left"/>
-            </w:pPr>
-            <w:r>
-              <w:rPr>
-                <w:rFonts w:ascii="Calibri" w:cs="Calibri" w:eastAsia="Calibri" w:hAnsi="Calibri"/>
-                <w:b w:val="false"/>
-                <w:bCs w:val="false"/>
-                <w:color w:val="000000"/>
-                <w:sz w:val="20"/>
-                <w:szCs w:val="20"/>
-              </w:rPr>
-              <w:t xml:space="preserve">Premissa de conversão (1 PB = 1.024 TB = 1.048.576 GB) tornada explícita em texto, garantindo que todos os cálculos subsequentes (Tabelas 2 e 3) usem a mesma base.</w:t>
+            <w:r>
+              <w:t>Base única: 3,5 PB = 3.500.000 GB; todas as classes e gráficos recalculados.</w:t>
             </w:r>
           </w:p>
         </w:tc>
@@ -6981,19 +6138,8 @@
             <w:vAlign w:val="center"/>
           </w:tcPr>
           <w:p>
-            <w:pPr>
-              <w:jc w:val="left"/>
-            </w:pPr>
-            <w:r>
-              <w:rPr>
-                <w:rFonts w:ascii="Calibri" w:cs="Calibri" w:eastAsia="Calibri" w:hAnsi="Calibri"/>
-                <w:b w:val="false"/>
-                <w:bCs w:val="false"/>
-                <w:color w:val="000000"/>
-                <w:sz w:val="20"/>
-                <w:szCs w:val="20"/>
-              </w:rPr>
-              <w:t xml:space="preserve">[Espaço para o grupo]</w:t>
+            <w:r>
+              <w:t>Custo de processamento e viabilidade por serviço estavam ausentes.</w:t>
             </w:r>
           </w:p>
         </w:tc>
@@ -7010,19 +6156,8 @@
             <w:vAlign w:val="center"/>
           </w:tcPr>
           <w:p>
-            <w:pPr>
-              <w:jc w:val="left"/>
-            </w:pPr>
-            <w:r>
-              <w:rPr>
-                <w:rFonts w:ascii="Calibri" w:cs="Calibri" w:eastAsia="Calibri" w:hAnsi="Calibri"/>
-                <w:b w:val="false"/>
-                <w:bCs w:val="false"/>
-                <w:color w:val="000000"/>
-                <w:sz w:val="20"/>
-                <w:szCs w:val="20"/>
-              </w:rPr>
-              <w:t xml:space="preserve">[Como o grupo identificou este erro durante a revisão final]</w:t>
+            <w:r>
+              <w:t>Cálculo Athena e consulta aos limites oficiais de S3/Aurora/EBS.</w:t>
             </w:r>
           </w:p>
         </w:tc>
@@ -7039,19 +6174,8 @@
             <w:vAlign w:val="center"/>
           </w:tcPr>
           <w:p>
-            <w:pPr>
-              <w:jc w:val="left"/>
-            </w:pPr>
-            <w:r>
-              <w:rPr>
-                <w:rFonts w:ascii="Calibri" w:cs="Calibri" w:eastAsia="Calibri" w:hAnsi="Calibri"/>
-                <w:b w:val="false"/>
-                <w:bCs w:val="false"/>
-                <w:color w:val="000000"/>
-                <w:sz w:val="20"/>
-                <w:szCs w:val="20"/>
-              </w:rPr>
-              <w:t xml:space="preserve">[Correção efetivamente aplicada pelo grupo]</w:t>
+            <w:r>
+              <w:t>Cenários, arquitetura de data lake, limites, RPO/RTO e TCO adicionados.</w:t>
             </w:r>
           </w:p>
         </w:tc>
@@ -8697,20 +7821,6 @@
           <w:szCs w:val="21"/>
         </w:rPr>
         <w:t xml:space="preserve">NIST — National Institute of Standards and Technology. The NIST Definition of Cloud Computing (SP 800-145).</w:t>
-      </w:r>
-    </w:p>
-    <w:p>
-      <w:pPr>
-        <w:spacing w:after="160" w:line="280"/>
-        <w:ind w:left="400" w:hanging="400"/>
-      </w:pPr>
-      <w:r>
-        <w:rPr>
-          <w:rFonts w:ascii="Calibri" w:cs="Calibri" w:eastAsia="Calibri" w:hAnsi="Calibri"/>
-          <w:sz w:val="21"/>
-          <w:szCs w:val="21"/>
-        </w:rPr>
-        <w:t xml:space="preserve">[Grupo]: incluir aqui quaisquer outras fontes efetivamente consultadas (sites dos provedores, artigos, documentação oficial), conforme utilizadas na elaboração final do trabalho.</w:t>
       </w:r>
     </w:p>
     <w:sectPr>

</xml_diff>